<commit_message>
chore: checkpoint in-flight work from parallel sessions before demo-flow build
Co-Authored-By: Claude Fable 5 <noreply@anthropic.com>
</commit_message>
<xml_diff>
--- a/public/artifacts/darb-screening-memo.docx
+++ b/public/artifacts/darb-screening-memo.docx
@@ -69,7 +69,7 @@
     </w:p>
     <w:p>
       <w:pPr>
-        <w:spacing w:after="260" w:before="160"/>
+        <w:spacing w:after="200" w:before="160"/>
         <w:jc w:val="center"/>
       </w:pPr>
       <w:r>
@@ -86,7 +86,7 @@
     </w:p>
     <w:p>
       <w:pPr>
-        <w:spacing w:after="80"/>
+        <w:spacing w:after="60"/>
         <w:jc w:val="center"/>
       </w:pPr>
       <w:r>
@@ -94,11 +94,11 @@
           <w:rFonts w:ascii="Georgia" w:cs="Georgia" w:eastAsia="Georgia" w:hAnsi="Georgia"/>
           <w:b/>
           <w:bCs/>
-          <w:color w:val="3E6B49"/>
-          <w:sz w:val="56"/>
-          <w:szCs w:val="56"/>
-        </w:rPr>
-        <w:t xml:space="preserve">ADVANCE TO PITCH MEETING</w:t>
+          <w:color w:val="2A2620"/>
+          <w:sz w:val="40"/>
+          <w:szCs w:val="40"/>
+        </w:rPr>
+        <w:t xml:space="preserve">Screening Outcome: Advance to Pitch Meeting</w:t>
       </w:r>
     </w:p>
     <w:p>
@@ -113,7 +113,7 @@
           <w:sz w:val="23"/>
           <w:szCs w:val="23"/>
         </w:rPr>
-        <w:t xml:space="preserve">Series B · SAR 40M ask · Logistics SaaS · Riyadh</w:t>
+        <w:t xml:space="preserve">5 of 6 Charter criteria pass · 1 concentration flag requiring IC acknowledgement</w:t>
       </w:r>
     </w:p>
     <w:tbl>
@@ -131,12 +131,14 @@
       <w:tblGrid>
         <w:gridCol w:w="100"/>
         <w:gridCol w:w="100"/>
+        <w:gridCol w:w="100"/>
+        <w:gridCol w:w="100"/>
       </w:tblGrid>
       <w:tr>
         <w:tc>
           <w:tcPr>
-            <w:tcW w:type="pct" w:w="42%"/>
-            <w:shd w:fill="FBF9F4" w:color="auto" w:val="clear"/>
+            <w:tcW w:type="pct" w:w="18%"/>
+            <w:shd w:fill="2A2620" w:color="auto" w:val="clear"/>
             <w:tcMar>
               <w:top w:type="dxa" w:w="70"/>
               <w:left w:type="dxa" w:w="110"/>
@@ -154,39 +156,96 @@
                 <w:rFonts w:ascii="Arial" w:cs="Arial" w:eastAsia="Arial" w:hAnsi="Arial"/>
                 <w:b/>
                 <w:bCs/>
-                <w:color w:val="2A2620"/>
-                <w:sz w:val="19"/>
-                <w:szCs w:val="19"/>
-              </w:rPr>
-              <w:t xml:space="preserve">Round / ask</w:t>
-            </w:r>
-          </w:p>
-        </w:tc>
-        <w:tc>
-          <w:tcPr>
-            <w:tcW w:type="pct" w:w="58%"/>
-            <w:tcMar>
-              <w:top w:type="dxa" w:w="70"/>
-              <w:left w:type="dxa" w:w="110"/>
-              <w:bottom w:type="dxa" w:w="70"/>
-              <w:right w:type="dxa" w:w="110"/>
-            </w:tcMar>
-            <w:vAlign w:val="center"/>
-          </w:tcPr>
-          <w:p>
-            <w:pPr>
-              <w:jc w:val="left"/>
-            </w:pPr>
-            <w:r>
-              <w:rPr>
-                <w:rFonts w:ascii="Arial" w:cs="Arial" w:eastAsia="Arial" w:hAnsi="Arial"/>
-                <w:b w:val="false"/>
-                <w:bCs w:val="false"/>
-                <w:color w:val="2A2620"/>
-                <w:sz w:val="19"/>
-                <w:szCs w:val="19"/>
-              </w:rPr>
-              <w:t xml:space="preserve">Series B · SAR 40M</w:t>
+                <w:color w:val="F5F1E6"/>
+                <w:sz w:val="19"/>
+                <w:szCs w:val="19"/>
+              </w:rPr>
+              <w:t xml:space="preserve">Company</w:t>
+            </w:r>
+          </w:p>
+        </w:tc>
+        <w:tc>
+          <w:tcPr>
+            <w:tcW w:type="pct" w:w="32%"/>
+            <w:tcMar>
+              <w:top w:type="dxa" w:w="70"/>
+              <w:left w:type="dxa" w:w="110"/>
+              <w:bottom w:type="dxa" w:w="70"/>
+              <w:right w:type="dxa" w:w="110"/>
+            </w:tcMar>
+            <w:vAlign w:val="center"/>
+          </w:tcPr>
+          <w:p>
+            <w:pPr>
+              <w:jc w:val="left"/>
+            </w:pPr>
+            <w:r>
+              <w:rPr>
+                <w:rFonts w:ascii="Arial" w:cs="Arial" w:eastAsia="Arial" w:hAnsi="Arial"/>
+                <w:b w:val="false"/>
+                <w:bCs w:val="false"/>
+                <w:color w:val="2A2620"/>
+                <w:sz w:val="19"/>
+                <w:szCs w:val="19"/>
+              </w:rPr>
+              <w:t xml:space="preserve">Darb Logistics Technology</w:t>
+            </w:r>
+          </w:p>
+        </w:tc>
+        <w:tc>
+          <w:tcPr>
+            <w:tcW w:type="pct" w:w="18%"/>
+            <w:shd w:fill="2A2620" w:color="auto" w:val="clear"/>
+            <w:tcMar>
+              <w:top w:type="dxa" w:w="70"/>
+              <w:left w:type="dxa" w:w="110"/>
+              <w:bottom w:type="dxa" w:w="70"/>
+              <w:right w:type="dxa" w:w="110"/>
+            </w:tcMar>
+            <w:vAlign w:val="center"/>
+          </w:tcPr>
+          <w:p>
+            <w:pPr>
+              <w:jc w:val="left"/>
+            </w:pPr>
+            <w:r>
+              <w:rPr>
+                <w:rFonts w:ascii="Arial" w:cs="Arial" w:eastAsia="Arial" w:hAnsi="Arial"/>
+                <w:b/>
+                <w:bCs/>
+                <w:color w:val="F5F1E6"/>
+                <w:sz w:val="19"/>
+                <w:szCs w:val="19"/>
+              </w:rPr>
+              <w:t xml:space="preserve">Sector</w:t>
+            </w:r>
+          </w:p>
+        </w:tc>
+        <w:tc>
+          <w:tcPr>
+            <w:tcW w:type="pct" w:w="32%"/>
+            <w:tcMar>
+              <w:top w:type="dxa" w:w="70"/>
+              <w:left w:type="dxa" w:w="110"/>
+              <w:bottom w:type="dxa" w:w="70"/>
+              <w:right w:type="dxa" w:w="110"/>
+            </w:tcMar>
+            <w:vAlign w:val="center"/>
+          </w:tcPr>
+          <w:p>
+            <w:pPr>
+              <w:jc w:val="left"/>
+            </w:pPr>
+            <w:r>
+              <w:rPr>
+                <w:rFonts w:ascii="Arial" w:cs="Arial" w:eastAsia="Arial" w:hAnsi="Arial"/>
+                <w:b w:val="false"/>
+                <w:bCs w:val="false"/>
+                <w:color w:val="2A2620"/>
+                <w:sz w:val="19"/>
+                <w:szCs w:val="19"/>
+              </w:rPr>
+              <w:t xml:space="preserve">Logistics SaaS</w:t>
             </w:r>
           </w:p>
         </w:tc>
@@ -194,8 +253,8 @@
       <w:tr>
         <w:tc>
           <w:tcPr>
-            <w:tcW w:type="pct" w:w="42%"/>
-            <w:shd w:fill="FBF9F4" w:color="auto" w:val="clear"/>
+            <w:tcW w:type="pct" w:w="18%"/>
+            <w:shd w:fill="2A2620" w:color="auto" w:val="clear"/>
             <w:tcMar>
               <w:top w:type="dxa" w:w="70"/>
               <w:left w:type="dxa" w:w="110"/>
@@ -213,39 +272,96 @@
                 <w:rFonts w:ascii="Arial" w:cs="Arial" w:eastAsia="Arial" w:hAnsi="Arial"/>
                 <w:b/>
                 <w:bCs/>
-                <w:color w:val="2A2620"/>
-                <w:sz w:val="19"/>
-                <w:szCs w:val="19"/>
-              </w:rPr>
-              <w:t xml:space="preserve">Sector / headquarters</w:t>
-            </w:r>
-          </w:p>
-        </w:tc>
-        <w:tc>
-          <w:tcPr>
-            <w:tcW w:type="pct" w:w="58%"/>
-            <w:tcMar>
-              <w:top w:type="dxa" w:w="70"/>
-              <w:left w:type="dxa" w:w="110"/>
-              <w:bottom w:type="dxa" w:w="70"/>
-              <w:right w:type="dxa" w:w="110"/>
-            </w:tcMar>
-            <w:vAlign w:val="center"/>
-          </w:tcPr>
-          <w:p>
-            <w:pPr>
-              <w:jc w:val="left"/>
-            </w:pPr>
-            <w:r>
-              <w:rPr>
-                <w:rFonts w:ascii="Arial" w:cs="Arial" w:eastAsia="Arial" w:hAnsi="Arial"/>
-                <w:b w:val="false"/>
-                <w:bCs w:val="false"/>
-                <w:color w:val="2A2620"/>
-                <w:sz w:val="19"/>
-                <w:szCs w:val="19"/>
-              </w:rPr>
-              <w:t xml:space="preserve">Logistics SaaS · Riyadh, Saudi Arabia</w:t>
+                <w:color w:val="F5F1E6"/>
+                <w:sz w:val="19"/>
+                <w:szCs w:val="19"/>
+              </w:rPr>
+              <w:t xml:space="preserve">Transaction</w:t>
+            </w:r>
+          </w:p>
+        </w:tc>
+        <w:tc>
+          <w:tcPr>
+            <w:tcW w:type="pct" w:w="32%"/>
+            <w:tcMar>
+              <w:top w:type="dxa" w:w="70"/>
+              <w:left w:type="dxa" w:w="110"/>
+              <w:bottom w:type="dxa" w:w="70"/>
+              <w:right w:type="dxa" w:w="110"/>
+            </w:tcMar>
+            <w:vAlign w:val="center"/>
+          </w:tcPr>
+          <w:p>
+            <w:pPr>
+              <w:jc w:val="left"/>
+            </w:pPr>
+            <w:r>
+              <w:rPr>
+                <w:rFonts w:ascii="Arial" w:cs="Arial" w:eastAsia="Arial" w:hAnsi="Arial"/>
+                <w:b w:val="false"/>
+                <w:bCs w:val="false"/>
+                <w:color w:val="2A2620"/>
+                <w:sz w:val="19"/>
+                <w:szCs w:val="19"/>
+              </w:rPr>
+              <w:t xml:space="preserve">Series B · primary</w:t>
+            </w:r>
+          </w:p>
+        </w:tc>
+        <w:tc>
+          <w:tcPr>
+            <w:tcW w:type="pct" w:w="18%"/>
+            <w:shd w:fill="2A2620" w:color="auto" w:val="clear"/>
+            <w:tcMar>
+              <w:top w:type="dxa" w:w="70"/>
+              <w:left w:type="dxa" w:w="110"/>
+              <w:bottom w:type="dxa" w:w="70"/>
+              <w:right w:type="dxa" w:w="110"/>
+            </w:tcMar>
+            <w:vAlign w:val="center"/>
+          </w:tcPr>
+          <w:p>
+            <w:pPr>
+              <w:jc w:val="left"/>
+            </w:pPr>
+            <w:r>
+              <w:rPr>
+                <w:rFonts w:ascii="Arial" w:cs="Arial" w:eastAsia="Arial" w:hAnsi="Arial"/>
+                <w:b/>
+                <w:bCs/>
+                <w:color w:val="F5F1E6"/>
+                <w:sz w:val="19"/>
+                <w:szCs w:val="19"/>
+              </w:rPr>
+              <w:t xml:space="preserve">Ask</w:t>
+            </w:r>
+          </w:p>
+        </w:tc>
+        <w:tc>
+          <w:tcPr>
+            <w:tcW w:type="pct" w:w="32%"/>
+            <w:tcMar>
+              <w:top w:type="dxa" w:w="70"/>
+              <w:left w:type="dxa" w:w="110"/>
+              <w:bottom w:type="dxa" w:w="70"/>
+              <w:right w:type="dxa" w:w="110"/>
+            </w:tcMar>
+            <w:vAlign w:val="center"/>
+          </w:tcPr>
+          <w:p>
+            <w:pPr>
+              <w:jc w:val="left"/>
+            </w:pPr>
+            <w:r>
+              <w:rPr>
+                <w:rFonts w:ascii="Arial" w:cs="Arial" w:eastAsia="Arial" w:hAnsi="Arial"/>
+                <w:b w:val="false"/>
+                <w:bCs w:val="false"/>
+                <w:color w:val="2A2620"/>
+                <w:sz w:val="19"/>
+                <w:szCs w:val="19"/>
+              </w:rPr>
+              <w:t xml:space="preserve">SAR 40M</w:t>
             </w:r>
           </w:p>
         </w:tc>
@@ -253,8 +369,8 @@
       <w:tr>
         <w:tc>
           <w:tcPr>
-            <w:tcW w:type="pct" w:w="42%"/>
-            <w:shd w:fill="FBF9F4" w:color="auto" w:val="clear"/>
+            <w:tcW w:type="pct" w:w="18%"/>
+            <w:shd w:fill="2A2620" w:color="auto" w:val="clear"/>
             <w:tcMar>
               <w:top w:type="dxa" w:w="70"/>
               <w:left w:type="dxa" w:w="110"/>
@@ -272,39 +388,96 @@
                 <w:rFonts w:ascii="Arial" w:cs="Arial" w:eastAsia="Arial" w:hAnsi="Arial"/>
                 <w:b/>
                 <w:bCs/>
-                <w:color w:val="2A2620"/>
-                <w:sz w:val="19"/>
-                <w:szCs w:val="19"/>
-              </w:rPr>
-              <w:t xml:space="preserve">ARR (company-reported, unaudited)</w:t>
-            </w:r>
-          </w:p>
-        </w:tc>
-        <w:tc>
-          <w:tcPr>
-            <w:tcW w:type="pct" w:w="58%"/>
-            <w:tcMar>
-              <w:top w:type="dxa" w:w="70"/>
-              <w:left w:type="dxa" w:w="110"/>
-              <w:bottom w:type="dxa" w:w="70"/>
-              <w:right w:type="dxa" w:w="110"/>
-            </w:tcMar>
-            <w:vAlign w:val="center"/>
-          </w:tcPr>
-          <w:p>
-            <w:pPr>
-              <w:jc w:val="left"/>
-            </w:pPr>
-            <w:r>
-              <w:rPr>
-                <w:rFonts w:ascii="Arial" w:cs="Arial" w:eastAsia="Arial" w:hAnsi="Arial"/>
-                <w:b w:val="false"/>
-                <w:bCs w:val="false"/>
-                <w:color w:val="2A2620"/>
-                <w:sz w:val="19"/>
-                <w:szCs w:val="19"/>
-              </w:rPr>
-              <w:t xml:space="preserve">SAR 18.2m FY2025A · SAR 29.5m FY2026E guided</w:t>
+                <w:color w:val="F5F1E6"/>
+                <w:sz w:val="19"/>
+                <w:szCs w:val="19"/>
+              </w:rPr>
+              <w:t xml:space="preserve">Geography</w:t>
+            </w:r>
+          </w:p>
+        </w:tc>
+        <w:tc>
+          <w:tcPr>
+            <w:tcW w:type="pct" w:w="32%"/>
+            <w:tcMar>
+              <w:top w:type="dxa" w:w="70"/>
+              <w:left w:type="dxa" w:w="110"/>
+              <w:bottom w:type="dxa" w:w="70"/>
+              <w:right w:type="dxa" w:w="110"/>
+            </w:tcMar>
+            <w:vAlign w:val="center"/>
+          </w:tcPr>
+          <w:p>
+            <w:pPr>
+              <w:jc w:val="left"/>
+            </w:pPr>
+            <w:r>
+              <w:rPr>
+                <w:rFonts w:ascii="Arial" w:cs="Arial" w:eastAsia="Arial" w:hAnsi="Arial"/>
+                <w:b w:val="false"/>
+                <w:bCs w:val="false"/>
+                <w:color w:val="2A2620"/>
+                <w:sz w:val="19"/>
+                <w:szCs w:val="19"/>
+              </w:rPr>
+              <w:t xml:space="preserve">Riyadh, Saudi Arabia</w:t>
+            </w:r>
+          </w:p>
+        </w:tc>
+        <w:tc>
+          <w:tcPr>
+            <w:tcW w:type="pct" w:w="18%"/>
+            <w:shd w:fill="2A2620" w:color="auto" w:val="clear"/>
+            <w:tcMar>
+              <w:top w:type="dxa" w:w="70"/>
+              <w:left w:type="dxa" w:w="110"/>
+              <w:bottom w:type="dxa" w:w="70"/>
+              <w:right w:type="dxa" w:w="110"/>
+            </w:tcMar>
+            <w:vAlign w:val="center"/>
+          </w:tcPr>
+          <w:p>
+            <w:pPr>
+              <w:jc w:val="left"/>
+            </w:pPr>
+            <w:r>
+              <w:rPr>
+                <w:rFonts w:ascii="Arial" w:cs="Arial" w:eastAsia="Arial" w:hAnsi="Arial"/>
+                <w:b/>
+                <w:bCs/>
+                <w:color w:val="F5F1E6"/>
+                <w:sz w:val="19"/>
+                <w:szCs w:val="19"/>
+              </w:rPr>
+              <w:t xml:space="preserve">Founded</w:t>
+            </w:r>
+          </w:p>
+        </w:tc>
+        <w:tc>
+          <w:tcPr>
+            <w:tcW w:type="pct" w:w="32%"/>
+            <w:tcMar>
+              <w:top w:type="dxa" w:w="70"/>
+              <w:left w:type="dxa" w:w="110"/>
+              <w:bottom w:type="dxa" w:w="70"/>
+              <w:right w:type="dxa" w:w="110"/>
+            </w:tcMar>
+            <w:vAlign w:val="center"/>
+          </w:tcPr>
+          <w:p>
+            <w:pPr>
+              <w:jc w:val="left"/>
+            </w:pPr>
+            <w:r>
+              <w:rPr>
+                <w:rFonts w:ascii="Arial" w:cs="Arial" w:eastAsia="Arial" w:hAnsi="Arial"/>
+                <w:b w:val="false"/>
+                <w:bCs w:val="false"/>
+                <w:color w:val="2A2620"/>
+                <w:sz w:val="19"/>
+                <w:szCs w:val="19"/>
+              </w:rPr>
+              <w:t xml:space="preserve">2022</w:t>
             </w:r>
           </w:p>
         </w:tc>
@@ -312,8 +485,8 @@
       <w:tr>
         <w:tc>
           <w:tcPr>
-            <w:tcW w:type="pct" w:w="42%"/>
-            <w:shd w:fill="FBF9F4" w:color="auto" w:val="clear"/>
+            <w:tcW w:type="pct" w:w="18%"/>
+            <w:shd w:fill="2A2620" w:color="auto" w:val="clear"/>
             <w:tcMar>
               <w:top w:type="dxa" w:w="70"/>
               <w:left w:type="dxa" w:w="110"/>
@@ -331,39 +504,96 @@
                 <w:rFonts w:ascii="Arial" w:cs="Arial" w:eastAsia="Arial" w:hAnsi="Arial"/>
                 <w:b/>
                 <w:bCs/>
-                <w:color w:val="2A2620"/>
-                <w:sz w:val="19"/>
-                <w:szCs w:val="19"/>
-              </w:rPr>
-              <w:t xml:space="preserve">Net revenue retention (FY2025A)</w:t>
-            </w:r>
-          </w:p>
-        </w:tc>
-        <w:tc>
-          <w:tcPr>
-            <w:tcW w:type="pct" w:w="58%"/>
-            <w:tcMar>
-              <w:top w:type="dxa" w:w="70"/>
-              <w:left w:type="dxa" w:w="110"/>
-              <w:bottom w:type="dxa" w:w="70"/>
-              <w:right w:type="dxa" w:w="110"/>
-            </w:tcMar>
-            <w:vAlign w:val="center"/>
-          </w:tcPr>
-          <w:p>
-            <w:pPr>
-              <w:jc w:val="left"/>
-            </w:pPr>
-            <w:r>
-              <w:rPr>
-                <w:rFonts w:ascii="Arial" w:cs="Arial" w:eastAsia="Arial" w:hAnsi="Arial"/>
-                <w:b w:val="false"/>
-                <w:bCs w:val="false"/>
-                <w:color w:val="2A2620"/>
-                <w:sz w:val="19"/>
-                <w:szCs w:val="19"/>
-              </w:rPr>
-              <w:t xml:space="preserve">118%</w:t>
+                <w:color w:val="F5F1E6"/>
+                <w:sz w:val="19"/>
+                <w:szCs w:val="19"/>
+              </w:rPr>
+              <w:t xml:space="preserve">ARR (FY2025A)</w:t>
+            </w:r>
+          </w:p>
+        </w:tc>
+        <w:tc>
+          <w:tcPr>
+            <w:tcW w:type="pct" w:w="32%"/>
+            <w:tcMar>
+              <w:top w:type="dxa" w:w="70"/>
+              <w:left w:type="dxa" w:w="110"/>
+              <w:bottom w:type="dxa" w:w="70"/>
+              <w:right w:type="dxa" w:w="110"/>
+            </w:tcMar>
+            <w:vAlign w:val="center"/>
+          </w:tcPr>
+          <w:p>
+            <w:pPr>
+              <w:jc w:val="left"/>
+            </w:pPr>
+            <w:r>
+              <w:rPr>
+                <w:rFonts w:ascii="Arial" w:cs="Arial" w:eastAsia="Arial" w:hAnsi="Arial"/>
+                <w:b w:val="false"/>
+                <w:bCs w:val="false"/>
+                <w:color w:val="2A2620"/>
+                <w:sz w:val="19"/>
+                <w:szCs w:val="19"/>
+              </w:rPr>
+              <w:t xml:space="preserve">SAR 18.2m (company-reported)</w:t>
+            </w:r>
+          </w:p>
+        </w:tc>
+        <w:tc>
+          <w:tcPr>
+            <w:tcW w:type="pct" w:w="18%"/>
+            <w:shd w:fill="2A2620" w:color="auto" w:val="clear"/>
+            <w:tcMar>
+              <w:top w:type="dxa" w:w="70"/>
+              <w:left w:type="dxa" w:w="110"/>
+              <w:bottom w:type="dxa" w:w="70"/>
+              <w:right w:type="dxa" w:w="110"/>
+            </w:tcMar>
+            <w:vAlign w:val="center"/>
+          </w:tcPr>
+          <w:p>
+            <w:pPr>
+              <w:jc w:val="left"/>
+            </w:pPr>
+            <w:r>
+              <w:rPr>
+                <w:rFonts w:ascii="Arial" w:cs="Arial" w:eastAsia="Arial" w:hAnsi="Arial"/>
+                <w:b/>
+                <w:bCs/>
+                <w:color w:val="F5F1E6"/>
+                <w:sz w:val="19"/>
+                <w:szCs w:val="19"/>
+              </w:rPr>
+              <w:t xml:space="preserve">ARR (FY2026E)</w:t>
+            </w:r>
+          </w:p>
+        </w:tc>
+        <w:tc>
+          <w:tcPr>
+            <w:tcW w:type="pct" w:w="32%"/>
+            <w:tcMar>
+              <w:top w:type="dxa" w:w="70"/>
+              <w:left w:type="dxa" w:w="110"/>
+              <w:bottom w:type="dxa" w:w="70"/>
+              <w:right w:type="dxa" w:w="110"/>
+            </w:tcMar>
+            <w:vAlign w:val="center"/>
+          </w:tcPr>
+          <w:p>
+            <w:pPr>
+              <w:jc w:val="left"/>
+            </w:pPr>
+            <w:r>
+              <w:rPr>
+                <w:rFonts w:ascii="Arial" w:cs="Arial" w:eastAsia="Arial" w:hAnsi="Arial"/>
+                <w:b w:val="false"/>
+                <w:bCs w:val="false"/>
+                <w:color w:val="2A2620"/>
+                <w:sz w:val="19"/>
+                <w:szCs w:val="19"/>
+              </w:rPr>
+              <w:t xml:space="preserve">SAR 29.5m guided</w:t>
             </w:r>
           </w:p>
         </w:tc>
@@ -371,8 +601,8 @@
       <w:tr>
         <w:tc>
           <w:tcPr>
-            <w:tcW w:type="pct" w:w="42%"/>
-            <w:shd w:fill="FBF9F4" w:color="auto" w:val="clear"/>
+            <w:tcW w:type="pct" w:w="18%"/>
+            <w:shd w:fill="2A2620" w:color="auto" w:val="clear"/>
             <w:tcMar>
               <w:top w:type="dxa" w:w="70"/>
               <w:left w:type="dxa" w:w="110"/>
@@ -390,39 +620,96 @@
                 <w:rFonts w:ascii="Arial" w:cs="Arial" w:eastAsia="Arial" w:hAnsi="Arial"/>
                 <w:b/>
                 <w:bCs/>
-                <w:color w:val="2A2620"/>
-                <w:sz w:val="19"/>
-                <w:szCs w:val="19"/>
-              </w:rPr>
-              <w:t xml:space="preserve">Screening result</w:t>
-            </w:r>
-          </w:p>
-        </w:tc>
-        <w:tc>
-          <w:tcPr>
-            <w:tcW w:type="pct" w:w="58%"/>
-            <w:tcMar>
-              <w:top w:type="dxa" w:w="70"/>
-              <w:left w:type="dxa" w:w="110"/>
-              <w:bottom w:type="dxa" w:w="70"/>
-              <w:right w:type="dxa" w:w="110"/>
-            </w:tcMar>
-            <w:vAlign w:val="center"/>
-          </w:tcPr>
-          <w:p>
-            <w:pPr>
-              <w:jc w:val="left"/>
-            </w:pPr>
-            <w:r>
-              <w:rPr>
-                <w:rFonts w:ascii="Arial" w:cs="Arial" w:eastAsia="Arial" w:hAnsi="Arial"/>
-                <w:b w:val="false"/>
-                <w:bCs w:val="false"/>
-                <w:color w:val="2A2620"/>
-                <w:sz w:val="19"/>
-                <w:szCs w:val="19"/>
-              </w:rPr>
-              <w:t xml:space="preserve">5 criteria pass · 1 concentration warning (IC acknowledgement required)</w:t>
+                <w:color w:val="F5F1E6"/>
+                <w:sz w:val="19"/>
+                <w:szCs w:val="19"/>
+              </w:rPr>
+              <w:t xml:space="preserve">NRR (FY2025A)</w:t>
+            </w:r>
+          </w:p>
+        </w:tc>
+        <w:tc>
+          <w:tcPr>
+            <w:tcW w:type="pct" w:w="32%"/>
+            <w:tcMar>
+              <w:top w:type="dxa" w:w="70"/>
+              <w:left w:type="dxa" w:w="110"/>
+              <w:bottom w:type="dxa" w:w="70"/>
+              <w:right w:type="dxa" w:w="110"/>
+            </w:tcMar>
+            <w:vAlign w:val="center"/>
+          </w:tcPr>
+          <w:p>
+            <w:pPr>
+              <w:jc w:val="left"/>
+            </w:pPr>
+            <w:r>
+              <w:rPr>
+                <w:rFonts w:ascii="Arial" w:cs="Arial" w:eastAsia="Arial" w:hAnsi="Arial"/>
+                <w:b w:val="false"/>
+                <w:bCs w:val="false"/>
+                <w:color w:val="2A2620"/>
+                <w:sz w:val="19"/>
+                <w:szCs w:val="19"/>
+              </w:rPr>
+              <w:t xml:space="preserve">118%</w:t>
+            </w:r>
+          </w:p>
+        </w:tc>
+        <w:tc>
+          <w:tcPr>
+            <w:tcW w:type="pct" w:w="18%"/>
+            <w:shd w:fill="2A2620" w:color="auto" w:val="clear"/>
+            <w:tcMar>
+              <w:top w:type="dxa" w:w="70"/>
+              <w:left w:type="dxa" w:w="110"/>
+              <w:bottom w:type="dxa" w:w="70"/>
+              <w:right w:type="dxa" w:w="110"/>
+            </w:tcMar>
+            <w:vAlign w:val="center"/>
+          </w:tcPr>
+          <w:p>
+            <w:pPr>
+              <w:jc w:val="left"/>
+            </w:pPr>
+            <w:r>
+              <w:rPr>
+                <w:rFonts w:ascii="Arial" w:cs="Arial" w:eastAsia="Arial" w:hAnsi="Arial"/>
+                <w:b/>
+                <w:bCs/>
+                <w:color w:val="F5F1E6"/>
+                <w:sz w:val="19"/>
+                <w:szCs w:val="19"/>
+              </w:rPr>
+              <w:t xml:space="preserve">Runway at close</w:t>
+            </w:r>
+          </w:p>
+        </w:tc>
+        <w:tc>
+          <w:tcPr>
+            <w:tcW w:type="pct" w:w="32%"/>
+            <w:tcMar>
+              <w:top w:type="dxa" w:w="70"/>
+              <w:left w:type="dxa" w:w="110"/>
+              <w:bottom w:type="dxa" w:w="70"/>
+              <w:right w:type="dxa" w:w="110"/>
+            </w:tcMar>
+            <w:vAlign w:val="center"/>
+          </w:tcPr>
+          <w:p>
+            <w:pPr>
+              <w:jc w:val="left"/>
+            </w:pPr>
+            <w:r>
+              <w:rPr>
+                <w:rFonts w:ascii="Arial" w:cs="Arial" w:eastAsia="Arial" w:hAnsi="Arial"/>
+                <w:b w:val="false"/>
+                <w:bCs w:val="false"/>
+                <w:color w:val="2A2620"/>
+                <w:sz w:val="19"/>
+                <w:szCs w:val="19"/>
+              </w:rPr>
+              <w:t xml:space="preserve">~24 months</w:t>
             </w:r>
           </w:p>
         </w:tc>
@@ -430,8 +717,8 @@
       <w:tr>
         <w:tc>
           <w:tcPr>
-            <w:tcW w:type="pct" w:w="42%"/>
-            <w:shd w:fill="FBF9F4" w:color="auto" w:val="clear"/>
+            <w:tcW w:type="pct" w:w="18%"/>
+            <w:shd w:fill="2A2620" w:color="auto" w:val="clear"/>
             <w:tcMar>
               <w:top w:type="dxa" w:w="70"/>
               <w:left w:type="dxa" w:w="110"/>
@@ -449,7 +736,64 @@
                 <w:rFonts w:ascii="Arial" w:cs="Arial" w:eastAsia="Arial" w:hAnsi="Arial"/>
                 <w:b/>
                 <w:bCs/>
-                <w:color w:val="2A2620"/>
+                <w:color w:val="F5F1E6"/>
+                <w:sz w:val="19"/>
+                <w:szCs w:val="19"/>
+              </w:rPr>
+              <w:t xml:space="preserve">Screening result</w:t>
+            </w:r>
+          </w:p>
+        </w:tc>
+        <w:tc>
+          <w:tcPr>
+            <w:tcW w:type="pct" w:w="32%"/>
+            <w:tcMar>
+              <w:top w:type="dxa" w:w="70"/>
+              <w:left w:type="dxa" w:w="110"/>
+              <w:bottom w:type="dxa" w:w="70"/>
+              <w:right w:type="dxa" w:w="110"/>
+            </w:tcMar>
+            <w:vAlign w:val="center"/>
+          </w:tcPr>
+          <w:p>
+            <w:pPr>
+              <w:jc w:val="left"/>
+            </w:pPr>
+            <w:r>
+              <w:rPr>
+                <w:rFonts w:ascii="Arial" w:cs="Arial" w:eastAsia="Arial" w:hAnsi="Arial"/>
+                <w:b w:val="false"/>
+                <w:bCs w:val="false"/>
+                <w:color w:val="2A2620"/>
+                <w:sz w:val="19"/>
+                <w:szCs w:val="19"/>
+              </w:rPr>
+              <w:t xml:space="preserve">5 of 6 pass · 1 flag</w:t>
+            </w:r>
+          </w:p>
+        </w:tc>
+        <w:tc>
+          <w:tcPr>
+            <w:tcW w:type="pct" w:w="18%"/>
+            <w:shd w:fill="2A2620" w:color="auto" w:val="clear"/>
+            <w:tcMar>
+              <w:top w:type="dxa" w:w="70"/>
+              <w:left w:type="dxa" w:w="110"/>
+              <w:bottom w:type="dxa" w:w="70"/>
+              <w:right w:type="dxa" w:w="110"/>
+            </w:tcMar>
+            <w:vAlign w:val="center"/>
+          </w:tcPr>
+          <w:p>
+            <w:pPr>
+              <w:jc w:val="left"/>
+            </w:pPr>
+            <w:r>
+              <w:rPr>
+                <w:rFonts w:ascii="Arial" w:cs="Arial" w:eastAsia="Arial" w:hAnsi="Arial"/>
+                <w:b/>
+                <w:bCs/>
+                <w:color w:val="F5F1E6"/>
                 <w:sz w:val="19"/>
                 <w:szCs w:val="19"/>
               </w:rPr>
@@ -459,7 +803,7 @@
         </w:tc>
         <w:tc>
           <w:tcPr>
-            <w:tcW w:type="pct" w:w="58%"/>
+            <w:tcW w:type="pct" w:w="32%"/>
             <w:tcMar>
               <w:top w:type="dxa" w:w="70"/>
               <w:left w:type="dxa" w:w="110"/>
@@ -499,7 +843,7 @@
           <w:sz w:val="17"/>
           <w:szCs w:val="17"/>
         </w:rPr>
-        <w:t xml:space="preserve">Contents: Purpose and Recommendation · Company at a Glance · Product and Market · Financial Summary · Use of Proceeds · Founding Team · Mandate Screening vs the IC Charter · Risks and Open Diligence Items · Sources</w:t>
+        <w:t xml:space="preserve">Contents: Executive Summary · Screening Outcome vs the IC Charter · Key Strengths and Concerns · Company and Market Overview · Financial Summary and Use of Proceeds · Sources</w:t>
       </w:r>
     </w:p>
     <w:p>
@@ -520,7 +864,7 @@
           <w:sz w:val="20"/>
           <w:szCs w:val="20"/>
         </w:rPr>
-        <w:t xml:space="preserve">A screening recommendation only, the investment decision rests with the Investment Committee.</w:t>
+        <w:t xml:space="preserve">A screening outcome only, the investment decision rests with the Investment Committee.</w:t>
       </w:r>
     </w:p>
     <w:p>
@@ -545,27 +889,39 @@
     </w:p>
     <w:p>
       <w:pPr>
+        <w:spacing w:after="0" w:before="220"/>
+      </w:pPr>
+    </w:p>
+    <w:p>
+      <w:pPr>
         <w:pStyle w:val="Heading1"/>
         <w:pBdr>
-          <w:bottom w:val="single" w:color="B08D2A" w:sz="10"/>
+          <w:bottom w:val="single" w:color="B08D2A" w:sz="12"/>
         </w:pBdr>
-        <w:spacing w:after="140" w:before="420"/>
+        <w:shd w:fill="2A2620" w:color="auto" w:val="clear"/>
+        <w:spacing w:after="240" w:before="90"/>
+        <w:ind w:left="172"/>
       </w:pPr>
       <w:r>
         <w:rPr>
           <w:rFonts w:ascii="Georgia" w:cs="Georgia" w:eastAsia="Georgia" w:hAnsi="Georgia"/>
           <w:b/>
           <w:bCs/>
-          <w:color w:val="2A2620"/>
-          <w:sz w:val="32"/>
-          <w:szCs w:val="32"/>
-        </w:rPr>
-        <w:t xml:space="preserve">Purpose and Recommendation</w:t>
-      </w:r>
-    </w:p>
-    <w:p>
-      <w:pPr>
-        <w:spacing w:after="160" w:line="264"/>
+          <w:color w:val="F5F1E6"/>
+          <w:sz w:val="28"/>
+          <w:szCs w:val="28"/>
+        </w:rPr>
+        <w:t xml:space="preserve">Executive Summary</w:t>
+      </w:r>
+    </w:p>
+    <w:p>
+      <w:pPr>
+        <w:pStyle w:val="ListParagraph"/>
+        <w:numPr>
+          <w:ilvl w:val="0"/>
+          <w:numId w:val="1"/>
+        </w:numPr>
+        <w:spacing w:after="100" w:line="256"/>
         <w:jc w:val="both"/>
       </w:pPr>
       <w:r>
@@ -575,12 +931,17 @@
           <w:sz w:val="21"/>
           <w:szCs w:val="21"/>
         </w:rPr>
-        <w:t xml:space="preserve">This memorandum summarizes the initial mandate screening of Darb Logistics Technology, an inbound Series B opportunity, against the Lunar Investments IC Charter. It is a screening-stage document: it establishes whether the opportunity clears the firm's baseline mandate criteria, not a full investment recommendation.</w:t>
-      </w:r>
-    </w:p>
-    <w:p>
-      <w:pPr>
-        <w:spacing w:after="160" w:line="264"/>
+        <w:t xml:space="preserve">Darb Logistics Technology is a Riyadh-based logistics SaaS company, founded in 2022, providing route optimization, live fleet operations, a carrier API layer and delivery analytics to last-mile and middle-mile operators; the product is subscription software deployed on the customer's existing fleet.</w:t>
+      </w:r>
+    </w:p>
+    <w:p>
+      <w:pPr>
+        <w:pStyle w:val="ListParagraph"/>
+        <w:numPr>
+          <w:ilvl w:val="0"/>
+          <w:numId w:val="1"/>
+        </w:numPr>
+        <w:spacing w:after="100" w:line="256"/>
         <w:jc w:val="both"/>
       </w:pPr>
       <w:r>
@@ -590,403 +951,129 @@
           <w:sz w:val="21"/>
           <w:szCs w:val="21"/>
         </w:rPr>
-        <w:t xml:space="preserve">Screening recommendation: advance Darb to a pitch meeting. Five of six criteria pass outright; the sixth, sector concentration, is flagged rather than failed. The Charter treats a post-deal concentration breach as requiring explicit Investment Committee acknowledgement before the deal may advance further, not as an automatic decline, this acknowledgement is a required step, not a formality to be assumed.</w:t>
-      </w:r>
-    </w:p>
-    <w:p>
-      <w:pPr>
-        <w:pStyle w:val="Heading1"/>
-        <w:pBdr>
-          <w:bottom w:val="single" w:color="B08D2A" w:sz="10"/>
-        </w:pBdr>
-        <w:spacing w:after="140" w:before="420"/>
-      </w:pPr>
-      <w:r>
-        <w:rPr>
-          <w:rFonts w:ascii="Georgia" w:cs="Georgia" w:eastAsia="Georgia" w:hAnsi="Georgia"/>
-          <w:b/>
-          <w:bCs/>
-          <w:color w:val="2A2620"/>
-          <w:sz w:val="32"/>
-          <w:szCs w:val="32"/>
-        </w:rPr>
-        <w:t xml:space="preserve">Company at a Glance</w:t>
-      </w:r>
-    </w:p>
-    <w:tbl>
-      <w:tblPr>
-        <w:tblW w:type="pct" w:w="100%"/>
-        <w:tblBorders>
-          <w:top w:val="single" w:color="B7AF9C" w:sz="4"/>
-          <w:left w:val="single" w:color="B7AF9C" w:sz="4"/>
-          <w:bottom w:val="single" w:color="B7AF9C" w:sz="4"/>
-          <w:right w:val="single" w:color="B7AF9C" w:sz="4"/>
-          <w:insideH w:val="single" w:color="D8D2C4" w:sz="4"/>
-          <w:insideV w:val="single" w:color="D8D2C4" w:sz="4"/>
-        </w:tblBorders>
-      </w:tblPr>
-      <w:tblGrid>
-        <w:gridCol w:w="100"/>
-        <w:gridCol w:w="100"/>
-      </w:tblGrid>
-      <w:tr>
-        <w:trPr>
-          <w:tblHeader/>
-        </w:trPr>
-        <w:tc>
-          <w:tcPr>
-            <w:tcW w:type="pct" w:w="30%"/>
-            <w:shd w:fill="2A2620" w:color="auto" w:val="clear"/>
-            <w:tcMar>
-              <w:top w:type="dxa" w:w="70"/>
-              <w:left w:type="dxa" w:w="110"/>
-              <w:bottom w:type="dxa" w:w="70"/>
-              <w:right w:type="dxa" w:w="110"/>
-            </w:tcMar>
-            <w:vAlign w:val="center"/>
-          </w:tcPr>
-          <w:p>
-            <w:pPr>
-              <w:jc w:val="left"/>
-            </w:pPr>
-            <w:r>
-              <w:rPr>
-                <w:rFonts w:ascii="Arial" w:cs="Arial" w:eastAsia="Arial" w:hAnsi="Arial"/>
-                <w:b/>
-                <w:bCs/>
-                <w:color w:val="F5F1E6"/>
-                <w:sz w:val="19"/>
-                <w:szCs w:val="19"/>
-              </w:rPr>
-              <w:t xml:space="preserve">Attribute</w:t>
-            </w:r>
-          </w:p>
-        </w:tc>
-        <w:tc>
-          <w:tcPr>
-            <w:tcW w:type="pct" w:w="70%"/>
-            <w:shd w:fill="2A2620" w:color="auto" w:val="clear"/>
-            <w:tcMar>
-              <w:top w:type="dxa" w:w="70"/>
-              <w:left w:type="dxa" w:w="110"/>
-              <w:bottom w:type="dxa" w:w="70"/>
-              <w:right w:type="dxa" w:w="110"/>
-            </w:tcMar>
-            <w:vAlign w:val="center"/>
-          </w:tcPr>
-          <w:p>
-            <w:pPr>
-              <w:jc w:val="center"/>
-            </w:pPr>
-            <w:r>
-              <w:rPr>
-                <w:rFonts w:ascii="Arial" w:cs="Arial" w:eastAsia="Arial" w:hAnsi="Arial"/>
-                <w:b/>
-                <w:bCs/>
-                <w:color w:val="F5F1E6"/>
-                <w:sz w:val="19"/>
-                <w:szCs w:val="19"/>
-              </w:rPr>
-              <w:t xml:space="preserve">Detail</w:t>
-            </w:r>
-          </w:p>
-        </w:tc>
-      </w:tr>
-      <w:tr>
-        <w:tc>
-          <w:tcPr>
-            <w:tcW w:type="pct" w:w="30%"/>
-            <w:tcMar>
-              <w:top w:type="dxa" w:w="70"/>
-              <w:left w:type="dxa" w:w="110"/>
-              <w:bottom w:type="dxa" w:w="70"/>
-              <w:right w:type="dxa" w:w="110"/>
-            </w:tcMar>
-            <w:vAlign w:val="center"/>
-          </w:tcPr>
-          <w:p>
-            <w:pPr>
-              <w:jc w:val="left"/>
-            </w:pPr>
-            <w:r>
-              <w:rPr>
-                <w:rFonts w:ascii="Arial" w:cs="Arial" w:eastAsia="Arial" w:hAnsi="Arial"/>
-                <w:b w:val="false"/>
-                <w:bCs w:val="false"/>
-                <w:color w:val="2A2620"/>
-                <w:sz w:val="19"/>
-                <w:szCs w:val="19"/>
-              </w:rPr>
-              <w:t xml:space="preserve">Round</w:t>
-            </w:r>
-          </w:p>
-        </w:tc>
-        <w:tc>
-          <w:tcPr>
-            <w:tcW w:type="pct" w:w="70%"/>
-            <w:tcMar>
-              <w:top w:type="dxa" w:w="70"/>
-              <w:left w:type="dxa" w:w="110"/>
-              <w:bottom w:type="dxa" w:w="70"/>
-              <w:right w:type="dxa" w:w="110"/>
-            </w:tcMar>
-            <w:vAlign w:val="center"/>
-          </w:tcPr>
-          <w:p>
-            <w:pPr>
-              <w:jc w:val="center"/>
-            </w:pPr>
-            <w:r>
-              <w:rPr>
-                <w:rFonts w:ascii="Arial" w:cs="Arial" w:eastAsia="Arial" w:hAnsi="Arial"/>
-                <w:b w:val="false"/>
-                <w:bCs w:val="false"/>
-                <w:color w:val="2A2620"/>
-                <w:sz w:val="19"/>
-                <w:szCs w:val="19"/>
-              </w:rPr>
-              <w:t xml:space="preserve">SAR 40M Series B</w:t>
-            </w:r>
-          </w:p>
-        </w:tc>
-      </w:tr>
-      <w:tr>
-        <w:tc>
-          <w:tcPr>
-            <w:tcW w:type="pct" w:w="30%"/>
-            <w:shd w:fill="FBF9F4" w:color="auto" w:val="clear"/>
-            <w:tcMar>
-              <w:top w:type="dxa" w:w="70"/>
-              <w:left w:type="dxa" w:w="110"/>
-              <w:bottom w:type="dxa" w:w="70"/>
-              <w:right w:type="dxa" w:w="110"/>
-            </w:tcMar>
-            <w:vAlign w:val="center"/>
-          </w:tcPr>
-          <w:p>
-            <w:pPr>
-              <w:jc w:val="left"/>
-            </w:pPr>
-            <w:r>
-              <w:rPr>
-                <w:rFonts w:ascii="Arial" w:cs="Arial" w:eastAsia="Arial" w:hAnsi="Arial"/>
-                <w:b w:val="false"/>
-                <w:bCs w:val="false"/>
-                <w:color w:val="2A2620"/>
-                <w:sz w:val="19"/>
-                <w:szCs w:val="19"/>
-              </w:rPr>
-              <w:t xml:space="preserve">Sector</w:t>
-            </w:r>
-          </w:p>
-        </w:tc>
-        <w:tc>
-          <w:tcPr>
-            <w:tcW w:type="pct" w:w="70%"/>
-            <w:shd w:fill="FBF9F4" w:color="auto" w:val="clear"/>
-            <w:tcMar>
-              <w:top w:type="dxa" w:w="70"/>
-              <w:left w:type="dxa" w:w="110"/>
-              <w:bottom w:type="dxa" w:w="70"/>
-              <w:right w:type="dxa" w:w="110"/>
-            </w:tcMar>
-            <w:vAlign w:val="center"/>
-          </w:tcPr>
-          <w:p>
-            <w:pPr>
-              <w:jc w:val="center"/>
-            </w:pPr>
-            <w:r>
-              <w:rPr>
-                <w:rFonts w:ascii="Arial" w:cs="Arial" w:eastAsia="Arial" w:hAnsi="Arial"/>
-                <w:b w:val="false"/>
-                <w:bCs w:val="false"/>
-                <w:color w:val="2A2620"/>
-                <w:sz w:val="19"/>
-                <w:szCs w:val="19"/>
-              </w:rPr>
-              <w:t xml:space="preserve">Logistics SaaS</w:t>
-            </w:r>
-          </w:p>
-        </w:tc>
-      </w:tr>
-      <w:tr>
-        <w:tc>
-          <w:tcPr>
-            <w:tcW w:type="pct" w:w="30%"/>
-            <w:tcMar>
-              <w:top w:type="dxa" w:w="70"/>
-              <w:left w:type="dxa" w:w="110"/>
-              <w:bottom w:type="dxa" w:w="70"/>
-              <w:right w:type="dxa" w:w="110"/>
-            </w:tcMar>
-            <w:vAlign w:val="center"/>
-          </w:tcPr>
-          <w:p>
-            <w:pPr>
-              <w:jc w:val="left"/>
-            </w:pPr>
-            <w:r>
-              <w:rPr>
-                <w:rFonts w:ascii="Arial" w:cs="Arial" w:eastAsia="Arial" w:hAnsi="Arial"/>
-                <w:b w:val="false"/>
-                <w:bCs w:val="false"/>
-                <w:color w:val="2A2620"/>
-                <w:sz w:val="19"/>
-                <w:szCs w:val="19"/>
-              </w:rPr>
-              <w:t xml:space="preserve">Headquarters</w:t>
-            </w:r>
-          </w:p>
-        </w:tc>
-        <w:tc>
-          <w:tcPr>
-            <w:tcW w:type="pct" w:w="70%"/>
-            <w:tcMar>
-              <w:top w:type="dxa" w:w="70"/>
-              <w:left w:type="dxa" w:w="110"/>
-              <w:bottom w:type="dxa" w:w="70"/>
-              <w:right w:type="dxa" w:w="110"/>
-            </w:tcMar>
-            <w:vAlign w:val="center"/>
-          </w:tcPr>
-          <w:p>
-            <w:pPr>
-              <w:jc w:val="center"/>
-            </w:pPr>
-            <w:r>
-              <w:rPr>
-                <w:rFonts w:ascii="Arial" w:cs="Arial" w:eastAsia="Arial" w:hAnsi="Arial"/>
-                <w:b w:val="false"/>
-                <w:bCs w:val="false"/>
-                <w:color w:val="2A2620"/>
-                <w:sz w:val="19"/>
-                <w:szCs w:val="19"/>
-              </w:rPr>
-              <w:t xml:space="preserve">Riyadh, Kingdom of Saudi Arabia</w:t>
-            </w:r>
-          </w:p>
-        </w:tc>
-      </w:tr>
-      <w:tr>
-        <w:tc>
-          <w:tcPr>
-            <w:tcW w:type="pct" w:w="30%"/>
-            <w:shd w:fill="FBF9F4" w:color="auto" w:val="clear"/>
-            <w:tcMar>
-              <w:top w:type="dxa" w:w="70"/>
-              <w:left w:type="dxa" w:w="110"/>
-              <w:bottom w:type="dxa" w:w="70"/>
-              <w:right w:type="dxa" w:w="110"/>
-            </w:tcMar>
-            <w:vAlign w:val="center"/>
-          </w:tcPr>
-          <w:p>
-            <w:pPr>
-              <w:jc w:val="left"/>
-            </w:pPr>
-            <w:r>
-              <w:rPr>
-                <w:rFonts w:ascii="Arial" w:cs="Arial" w:eastAsia="Arial" w:hAnsi="Arial"/>
-                <w:b w:val="false"/>
-                <w:bCs w:val="false"/>
-                <w:color w:val="2A2620"/>
-                <w:sz w:val="19"/>
-                <w:szCs w:val="19"/>
-              </w:rPr>
-              <w:t xml:space="preserve">Founded</w:t>
-            </w:r>
-          </w:p>
-        </w:tc>
-        <w:tc>
-          <w:tcPr>
-            <w:tcW w:type="pct" w:w="70%"/>
-            <w:shd w:fill="FBF9F4" w:color="auto" w:val="clear"/>
-            <w:tcMar>
-              <w:top w:type="dxa" w:w="70"/>
-              <w:left w:type="dxa" w:w="110"/>
-              <w:bottom w:type="dxa" w:w="70"/>
-              <w:right w:type="dxa" w:w="110"/>
-            </w:tcMar>
-            <w:vAlign w:val="center"/>
-          </w:tcPr>
-          <w:p>
-            <w:pPr>
-              <w:jc w:val="center"/>
-            </w:pPr>
-            <w:r>
-              <w:rPr>
-                <w:rFonts w:ascii="Arial" w:cs="Arial" w:eastAsia="Arial" w:hAnsi="Arial"/>
-                <w:b w:val="false"/>
-                <w:bCs w:val="false"/>
-                <w:color w:val="2A2620"/>
-                <w:sz w:val="19"/>
-                <w:szCs w:val="19"/>
-              </w:rPr>
-              <w:t xml:space="preserve">2022</w:t>
-            </w:r>
-          </w:p>
-        </w:tc>
-      </w:tr>
-      <w:tr>
-        <w:tc>
-          <w:tcPr>
-            <w:tcW w:type="pct" w:w="30%"/>
-            <w:tcMar>
-              <w:top w:type="dxa" w:w="70"/>
-              <w:left w:type="dxa" w:w="110"/>
-              <w:bottom w:type="dxa" w:w="70"/>
-              <w:right w:type="dxa" w:w="110"/>
-            </w:tcMar>
-            <w:vAlign w:val="center"/>
-          </w:tcPr>
-          <w:p>
-            <w:pPr>
-              <w:jc w:val="left"/>
-            </w:pPr>
-            <w:r>
-              <w:rPr>
-                <w:rFonts w:ascii="Arial" w:cs="Arial" w:eastAsia="Arial" w:hAnsi="Arial"/>
-                <w:b w:val="false"/>
-                <w:bCs w:val="false"/>
-                <w:color w:val="2A2620"/>
-                <w:sz w:val="19"/>
-                <w:szCs w:val="19"/>
-              </w:rPr>
-              <w:t xml:space="preserve">Source of introduction</w:t>
-            </w:r>
-          </w:p>
-        </w:tc>
-        <w:tc>
-          <w:tcPr>
-            <w:tcW w:type="pct" w:w="70%"/>
-            <w:tcMar>
-              <w:top w:type="dxa" w:w="70"/>
-              <w:left w:type="dxa" w:w="110"/>
-              <w:bottom w:type="dxa" w:w="70"/>
-              <w:right w:type="dxa" w:w="110"/>
-            </w:tcMar>
-            <w:vAlign w:val="center"/>
-          </w:tcPr>
-          <w:p>
-            <w:pPr>
-              <w:jc w:val="center"/>
-            </w:pPr>
-            <w:r>
-              <w:rPr>
-                <w:rFonts w:ascii="Arial" w:cs="Arial" w:eastAsia="Arial" w:hAnsi="Arial"/>
-                <w:b w:val="false"/>
-                <w:bCs w:val="false"/>
-                <w:color w:val="2A2620"/>
-                <w:sz w:val="19"/>
-                <w:szCs w:val="19"/>
-              </w:rPr>
-              <w:t xml:space="preserve">Inbound, founder outreach via Lunar's private growth-equity desk</w:t>
-            </w:r>
-          </w:p>
-        </w:tc>
-      </w:tr>
-    </w:tbl>
+        <w:t xml:space="preserve">The inbound opportunity is a SAR 40M Series B, sourced via founder outreach to Lunar's private growth-equity desk.</w:t>
+      </w:r>
+    </w:p>
+    <w:p>
+      <w:pPr>
+        <w:pStyle w:val="ListParagraph"/>
+        <w:numPr>
+          <w:ilvl w:val="0"/>
+          <w:numId w:val="1"/>
+        </w:numPr>
+        <w:spacing w:after="100" w:line="256"/>
+        <w:jc w:val="both"/>
+      </w:pPr>
+      <w:r>
+        <w:rPr>
+          <w:rFonts w:ascii="Arial" w:cs="Arial" w:eastAsia="Arial" w:hAnsi="Arial"/>
+          <w:color w:val="2A2620"/>
+          <w:sz w:val="21"/>
+          <w:szCs w:val="21"/>
+        </w:rPr>
+        <w:t xml:space="preserve">Company-reported, unaudited figures show ARR of SAR 18.2m in FY2025A and SAR 29.5m guided for FY2026E (+62% YoY), gross margin of 68%, and net revenue retention of 118%.</w:t>
+      </w:r>
+    </w:p>
+    <w:p>
+      <w:pPr>
+        <w:pStyle w:val="ListParagraph"/>
+        <w:numPr>
+          <w:ilvl w:val="0"/>
+          <w:numId w:val="1"/>
+        </w:numPr>
+        <w:spacing w:after="100" w:line="256"/>
+        <w:jc w:val="both"/>
+      </w:pPr>
+      <w:r>
+        <w:rPr>
+          <w:rFonts w:ascii="Arial" w:cs="Arial" w:eastAsia="Arial" w:hAnsi="Arial"/>
+          <w:color w:val="2A2620"/>
+          <w:sz w:val="21"/>
+          <w:szCs w:val="21"/>
+        </w:rPr>
+        <w:t xml:space="preserve">Management indicates proceeds are earmarked roughly 55% for go-to-market expansion, 30% for product and engineering headcount, and 15% for working capital; post-round cash runway is guided at ~24 months.</w:t>
+      </w:r>
+    </w:p>
+    <w:p>
+      <w:pPr>
+        <w:pStyle w:val="ListParagraph"/>
+        <w:numPr>
+          <w:ilvl w:val="0"/>
+          <w:numId w:val="1"/>
+        </w:numPr>
+        <w:spacing w:after="100" w:line="256"/>
+        <w:jc w:val="both"/>
+      </w:pPr>
+      <w:r>
+        <w:rPr>
+          <w:rFonts w:ascii="Arial" w:cs="Arial" w:eastAsia="Arial" w:hAnsi="Arial"/>
+          <w:color w:val="2A2620"/>
+          <w:sz w:val="21"/>
+          <w:szCs w:val="21"/>
+        </w:rPr>
+        <w:t xml:space="preserve">Mandate screening against the Lunar IC Charter: five of six criteria pass outright; sector concentration is flagged, post-deal Technology &amp; Consumer exposure of 10.5% of firm AUM would exceed the Charter's 10% cap and requires explicit Investment Committee acknowledgement before the deal advances.</w:t>
+      </w:r>
+    </w:p>
+    <w:p>
+      <w:pPr>
+        <w:pStyle w:val="ListParagraph"/>
+        <w:numPr>
+          <w:ilvl w:val="0"/>
+          <w:numId w:val="1"/>
+        </w:numPr>
+        <w:spacing w:after="100" w:line="256"/>
+        <w:jc w:val="both"/>
+      </w:pPr>
+      <w:r>
+        <w:rPr>
+          <w:rFonts w:ascii="Arial" w:cs="Arial" w:eastAsia="Arial" w:hAnsi="Arial"/>
+          <w:color w:val="2A2620"/>
+          <w:sz w:val="21"/>
+          <w:szCs w:val="21"/>
+        </w:rPr>
+        <w:t xml:space="preserve">No sanctions, conflicts-of-interest, or related-party issues were identified at the pre-screen stage; the compliance pre-screen passes.</w:t>
+      </w:r>
+    </w:p>
+    <w:p>
+      <w:pPr>
+        <w:pStyle w:val="ListParagraph"/>
+        <w:numPr>
+          <w:ilvl w:val="0"/>
+          <w:numId w:val="1"/>
+        </w:numPr>
+        <w:spacing w:after="100" w:line="256"/>
+        <w:jc w:val="both"/>
+      </w:pPr>
+      <w:r>
+        <w:rPr>
+          <w:rFonts w:ascii="Arial" w:cs="Arial" w:eastAsia="Arial" w:hAnsi="Arial"/>
+          <w:color w:val="2A2620"/>
+          <w:sz w:val="21"/>
+          <w:szCs w:val="21"/>
+        </w:rPr>
+        <w:t xml:space="preserve">All figures in this memorandum are screening-stage and unaudited: audited FY2023-FY2025 statements, customer contracts, and cohort-level retention data are required diligence items under NDA.</w:t>
+      </w:r>
+    </w:p>
+    <w:p>
+      <w:pPr>
+        <w:pStyle w:val="ListParagraph"/>
+        <w:numPr>
+          <w:ilvl w:val="0"/>
+          <w:numId w:val="1"/>
+        </w:numPr>
+        <w:spacing w:after="100" w:line="256"/>
+        <w:jc w:val="both"/>
+      </w:pPr>
+      <w:r>
+        <w:rPr>
+          <w:rFonts w:ascii="Arial" w:cs="Arial" w:eastAsia="Arial" w:hAnsi="Arial"/>
+          <w:color w:val="2A2620"/>
+          <w:sz w:val="21"/>
+          <w:szCs w:val="21"/>
+        </w:rPr>
+        <w:t xml:space="preserve">This memorandum reports a screening outcome, not an investment recommendation; advancing past screening and any subsequent investment decision rest with the Investment Committee.</w:t>
+      </w:r>
+    </w:p>
     <w:p>
       <w:pPr>
         <w:spacing w:after="200" w:before="40"/>
@@ -1000,27 +1087,34 @@
           <w:sz w:val="17"/>
           <w:szCs w:val="17"/>
         </w:rPr>
-        <w:t xml:space="preserve">Source: Darb Data Room · Screening Summary, p.1</w:t>
-      </w:r>
+        <w:t xml:space="preserve">Source: Darb Data Room · Screening Summary, p.1; Source: Darb Data Room · Screening Summary, p.3; Source: Lunar IC Charter &amp; Investment Mandate, p.3.</w:t>
+      </w:r>
+    </w:p>
+    <w:p>
+      <w:pPr>
+        <w:spacing w:after="0" w:before="220"/>
+      </w:pPr>
     </w:p>
     <w:p>
       <w:pPr>
         <w:pStyle w:val="Heading1"/>
         <w:pBdr>
-          <w:bottom w:val="single" w:color="B08D2A" w:sz="10"/>
+          <w:bottom w:val="single" w:color="B08D2A" w:sz="12"/>
         </w:pBdr>
-        <w:spacing w:after="140" w:before="420"/>
+        <w:shd w:fill="2A2620" w:color="auto" w:val="clear"/>
+        <w:spacing w:after="240" w:before="90"/>
+        <w:ind w:left="172"/>
       </w:pPr>
       <w:r>
         <w:rPr>
           <w:rFonts w:ascii="Georgia" w:cs="Georgia" w:eastAsia="Georgia" w:hAnsi="Georgia"/>
           <w:b/>
           <w:bCs/>
-          <w:color w:val="2A2620"/>
-          <w:sz w:val="32"/>
-          <w:szCs w:val="32"/>
-        </w:rPr>
-        <w:t xml:space="preserve">Product and Market</w:t>
+          <w:color w:val="F5F1E6"/>
+          <w:sz w:val="28"/>
+          <w:szCs w:val="28"/>
+        </w:rPr>
+        <w:t xml:space="preserve">Screening Outcome vs the IC Charter</w:t>
       </w:r>
     </w:p>
     <w:p>
@@ -1035,115 +1129,7 @@
           <w:sz w:val="21"/>
           <w:szCs w:val="21"/>
         </w:rPr>
-        <w:t xml:space="preserve">Darb builds fleet- and route-optimization software for last-mile and middle-mile logistics operators in the Kingdom. The platform sits between shippers and carrier fleets, providing route planning, real-time tracking, proof-of-delivery, and carrier-performance analytics through a single dashboard and API layer. The product is deployed as subscription SaaS layered on the customer's existing fleet, avoiding the asset-heavy economics of an owned-fleet delivery business.</w:t>
-      </w:r>
-    </w:p>
-    <w:p>
-      <w:pPr>
-        <w:spacing w:after="90" w:before="220"/>
-      </w:pPr>
-      <w:r>
-        <w:rPr>
-          <w:rFonts w:ascii="Arial" w:cs="Arial" w:eastAsia="Arial" w:hAnsi="Arial"/>
-          <w:b/>
-          <w:bCs/>
-          <w:color w:val="514B40"/>
-          <w:sz w:val="24"/>
-          <w:szCs w:val="24"/>
-        </w:rPr>
-        <w:t xml:space="preserve">Product surface</w:t>
-      </w:r>
-    </w:p>
-    <w:p>
-      <w:pPr>
-        <w:pStyle w:val="ListParagraph"/>
-        <w:numPr>
-          <w:ilvl w:val="0"/>
-          <w:numId w:val="1"/>
-        </w:numPr>
-        <w:spacing w:after="80" w:line="250"/>
-      </w:pPr>
-      <w:r>
-        <w:rPr>
-          <w:rFonts w:ascii="Arial" w:cs="Arial" w:eastAsia="Arial" w:hAnsi="Arial"/>
-          <w:color w:val="2A2620"/>
-          <w:sz w:val="21"/>
-          <w:szCs w:val="21"/>
-        </w:rPr>
-        <w:t xml:space="preserve">Route Optimization Engine, dynamic routing across driver fleets</w:t>
-      </w:r>
-    </w:p>
-    <w:p>
-      <w:pPr>
-        <w:pStyle w:val="ListParagraph"/>
-        <w:numPr>
-          <w:ilvl w:val="0"/>
-          <w:numId w:val="1"/>
-        </w:numPr>
-        <w:spacing w:after="80" w:line="250"/>
-      </w:pPr>
-      <w:r>
-        <w:rPr>
-          <w:rFonts w:ascii="Arial" w:cs="Arial" w:eastAsia="Arial" w:hAnsi="Arial"/>
-          <w:color w:val="2A2620"/>
-          <w:sz w:val="21"/>
-          <w:szCs w:val="21"/>
-        </w:rPr>
-        <w:t xml:space="preserve">Fleet Ops Dashboard, live tracking, proof-of-delivery, exception management</w:t>
-      </w:r>
-    </w:p>
-    <w:p>
-      <w:pPr>
-        <w:pStyle w:val="ListParagraph"/>
-        <w:numPr>
-          <w:ilvl w:val="0"/>
-          <w:numId w:val="1"/>
-        </w:numPr>
-        <w:spacing w:after="80" w:line="250"/>
-      </w:pPr>
-      <w:r>
-        <w:rPr>
-          <w:rFonts w:ascii="Arial" w:cs="Arial" w:eastAsia="Arial" w:hAnsi="Arial"/>
-          <w:color w:val="2A2620"/>
-          <w:sz w:val="21"/>
-          <w:szCs w:val="21"/>
-        </w:rPr>
-        <w:t xml:space="preserve">Carrier API, integration layer for third-party carrier networks and quick-commerce platforms</w:t>
-      </w:r>
-    </w:p>
-    <w:p>
-      <w:pPr>
-        <w:pStyle w:val="ListParagraph"/>
-        <w:numPr>
-          <w:ilvl w:val="0"/>
-          <w:numId w:val="1"/>
-        </w:numPr>
-        <w:spacing w:after="80" w:line="250"/>
-      </w:pPr>
-      <w:r>
-        <w:rPr>
-          <w:rFonts w:ascii="Arial" w:cs="Arial" w:eastAsia="Arial" w:hAnsi="Arial"/>
-          <w:color w:val="2A2620"/>
-          <w:sz w:val="21"/>
-          <w:szCs w:val="21"/>
-        </w:rPr>
-        <w:t xml:space="preserve">Analytics Suite, delivery SLA, cost-per-order, and carrier-performance reporting</w:t>
-      </w:r>
-    </w:p>
-    <w:p>
-      <w:pPr>
-        <w:spacing w:after="90" w:before="220"/>
-      </w:pPr>
-      <w:r>
-        <w:rPr>
-          <w:rFonts w:ascii="Arial" w:cs="Arial" w:eastAsia="Arial" w:hAnsi="Arial"/>
-          <w:b/>
-          <w:bCs/>
-          <w:color w:val="514B40"/>
-          <w:sz w:val="24"/>
-          <w:szCs w:val="24"/>
-        </w:rPr>
-        <w:t xml:space="preserve">Market backdrop</w:t>
+        <w:t xml:space="preserve">This memorandum summarizes the initial mandate screening of Darb Logistics Technology, an inbound Series B opportunity, against the Lunar Investments IC Charter. It is a screening-stage document: it establishes whether the opportunity clears the firm's baseline mandate criteria, not a full investment analysis.</w:t>
       </w:r>
     </w:p>
     <w:p>
@@ -1158,58 +1144,7 @@
           <w:sz w:val="21"/>
           <w:szCs w:val="21"/>
         </w:rPr>
-        <w:t xml:space="preserve">Management frames the opportunity against rapid growth in Saudi e-commerce and quick-commerce delivery volumes, and the broader push toward logistics-sector digitization under Vision 2030's transport and logistics pillar. This is management's framing of the opportunity, presented here as a judgment to be tested in diligence, not an independently verified market estimate.</w:t>
-      </w:r>
-    </w:p>
-    <w:p>
-      <w:pPr>
-        <w:spacing w:after="200" w:before="40"/>
-      </w:pPr>
-      <w:r>
-        <w:rPr>
-          <w:rFonts w:ascii="Arial" w:cs="Arial" w:eastAsia="Arial" w:hAnsi="Arial"/>
-          <w:i/>
-          <w:iCs/>
-          <w:color w:val="6B6455"/>
-          <w:sz w:val="17"/>
-          <w:szCs w:val="17"/>
-        </w:rPr>
-        <w:t xml:space="preserve">Source: Darb Data Room · Screening Summary, p.2</w:t>
-      </w:r>
-    </w:p>
-    <w:p>
-      <w:pPr>
-        <w:pStyle w:val="Heading1"/>
-        <w:pBdr>
-          <w:bottom w:val="single" w:color="B08D2A" w:sz="10"/>
-        </w:pBdr>
-        <w:spacing w:after="140" w:before="420"/>
-      </w:pPr>
-      <w:r>
-        <w:rPr>
-          <w:rFonts w:ascii="Georgia" w:cs="Georgia" w:eastAsia="Georgia" w:hAnsi="Georgia"/>
-          <w:b/>
-          <w:bCs/>
-          <w:color w:val="2A2620"/>
-          <w:sz w:val="32"/>
-          <w:szCs w:val="32"/>
-        </w:rPr>
-        <w:t xml:space="preserve">Financial Summary</w:t>
-      </w:r>
-    </w:p>
-    <w:p>
-      <w:pPr>
-        <w:spacing w:after="160" w:line="264"/>
-        <w:jc w:val="both"/>
-      </w:pPr>
-      <w:r>
-        <w:rPr>
-          <w:rFonts w:ascii="Arial" w:cs="Arial" w:eastAsia="Arial" w:hAnsi="Arial"/>
-          <w:color w:val="2A2620"/>
-          <w:sz w:val="21"/>
-          <w:szCs w:val="21"/>
-        </w:rPr>
-        <w:t xml:space="preserve">The figures below are Darb's own reporting, unaudited, as shared at the screening stage. Full audited or reviewed financial statements for FY2023-FY2025 sit in the data room under NDA and are a required diligence item before any ticket is issued.</w:t>
+        <w:t xml:space="preserve">The Screening Agent checked Darb against every Charter criterion that applies to a private growth-equity opportunity. Five of six criteria pass outright; the sixth, sector concentration, is flagged rather than failed. The Charter treats a post-deal concentration breach as requiring explicit Investment Committee acknowledgement before the deal may advance further, not as an automatic decline; this acknowledgement is a required step, not a formality to be assumed.</w:t>
       </w:r>
     </w:p>
     <w:tbl>
@@ -1235,7 +1170,7 @@
         </w:trPr>
         <w:tc>
           <w:tcPr>
-            <w:tcW w:type="pct" w:w="40%"/>
+            <w:tcW w:type="pct" w:w="22%"/>
             <w:shd w:fill="2A2620" w:color="auto" w:val="clear"/>
             <w:tcMar>
               <w:top w:type="dxa" w:w="70"/>
@@ -1258,13 +1193,13 @@
                 <w:sz w:val="19"/>
                 <w:szCs w:val="19"/>
               </w:rPr>
-              <w:t xml:space="preserve">Metric</w:t>
-            </w:r>
-          </w:p>
-        </w:tc>
-        <w:tc>
-          <w:tcPr>
-            <w:tcW w:type="pct" w:w="30%"/>
+              <w:t xml:space="preserve">Criterion</w:t>
+            </w:r>
+          </w:p>
+        </w:tc>
+        <w:tc>
+          <w:tcPr>
+            <w:tcW w:type="pct" w:w="12%"/>
             <w:shd w:fill="2A2620" w:color="auto" w:val="clear"/>
             <w:tcMar>
               <w:top w:type="dxa" w:w="70"/>
@@ -1287,13 +1222,13 @@
                 <w:sz w:val="19"/>
                 <w:szCs w:val="19"/>
               </w:rPr>
-              <w:t xml:space="preserve">FY2025A</w:t>
-            </w:r>
-          </w:p>
-        </w:tc>
-        <w:tc>
-          <w:tcPr>
-            <w:tcW w:type="pct" w:w="30%"/>
+              <w:t xml:space="preserve">Verdict</w:t>
+            </w:r>
+          </w:p>
+        </w:tc>
+        <w:tc>
+          <w:tcPr>
+            <w:tcW w:type="pct" w:w="66%"/>
             <w:shd w:fill="2A2620" w:color="auto" w:val="clear"/>
             <w:tcMar>
               <w:top w:type="dxa" w:w="70"/>
@@ -1316,7 +1251,7 @@
                 <w:sz w:val="19"/>
                 <w:szCs w:val="19"/>
               </w:rPr>
-              <w:t xml:space="preserve">FY2026E</w:t>
+              <w:t xml:space="preserve">Detail</w:t>
             </w:r>
           </w:p>
         </w:tc>
@@ -1324,35 +1259,35 @@
       <w:tr>
         <w:tc>
           <w:tcPr>
-            <w:tcW w:type="pct" w:w="40%"/>
-            <w:tcMar>
-              <w:top w:type="dxa" w:w="70"/>
-              <w:left w:type="dxa" w:w="110"/>
-              <w:bottom w:type="dxa" w:w="70"/>
-              <w:right w:type="dxa" w:w="110"/>
-            </w:tcMar>
-            <w:vAlign w:val="center"/>
-          </w:tcPr>
-          <w:p>
-            <w:pPr>
-              <w:jc w:val="left"/>
-            </w:pPr>
-            <w:r>
-              <w:rPr>
-                <w:rFonts w:ascii="Arial" w:cs="Arial" w:eastAsia="Arial" w:hAnsi="Arial"/>
-                <w:b w:val="false"/>
-                <w:bCs w:val="false"/>
-                <w:color w:val="2A2620"/>
-                <w:sz w:val="19"/>
-                <w:szCs w:val="19"/>
-              </w:rPr>
-              <w:t xml:space="preserve">Annual Recurring Revenue (ARR)</w:t>
-            </w:r>
-          </w:p>
-        </w:tc>
-        <w:tc>
-          <w:tcPr>
-            <w:tcW w:type="pct" w:w="30%"/>
+            <w:tcW w:type="pct" w:w="22%"/>
+            <w:tcMar>
+              <w:top w:type="dxa" w:w="70"/>
+              <w:left w:type="dxa" w:w="110"/>
+              <w:bottom w:type="dxa" w:w="70"/>
+              <w:right w:type="dxa" w:w="110"/>
+            </w:tcMar>
+            <w:vAlign w:val="center"/>
+          </w:tcPr>
+          <w:p>
+            <w:pPr>
+              <w:jc w:val="left"/>
+            </w:pPr>
+            <w:r>
+              <w:rPr>
+                <w:rFonts w:ascii="Arial" w:cs="Arial" w:eastAsia="Arial" w:hAnsi="Arial"/>
+                <w:b w:val="false"/>
+                <w:bCs w:val="false"/>
+                <w:color w:val="2A2620"/>
+                <w:sz w:val="19"/>
+                <w:szCs w:val="19"/>
+              </w:rPr>
+              <w:t xml:space="preserve">Sector mandate</w:t>
+            </w:r>
+          </w:p>
+        </w:tc>
+        <w:tc>
+          <w:tcPr>
+            <w:tcW w:type="pct" w:w="12%"/>
             <w:tcMar>
               <w:top w:type="dxa" w:w="70"/>
               <w:left w:type="dxa" w:w="110"/>
@@ -1374,13 +1309,13 @@
                 <w:sz w:val="19"/>
                 <w:szCs w:val="19"/>
               </w:rPr>
-              <w:t xml:space="preserve">SAR 18.2m</w:t>
-            </w:r>
-          </w:p>
-        </w:tc>
-        <w:tc>
-          <w:tcPr>
-            <w:tcW w:type="pct" w:w="30%"/>
+              <w:t xml:space="preserve">PASS</w:t>
+            </w:r>
+          </w:p>
+        </w:tc>
+        <w:tc>
+          <w:tcPr>
+            <w:tcW w:type="pct" w:w="66%"/>
             <w:tcMar>
               <w:top w:type="dxa" w:w="70"/>
               <w:left w:type="dxa" w:w="110"/>
@@ -1402,7 +1337,7 @@
                 <w:sz w:val="19"/>
                 <w:szCs w:val="19"/>
               </w:rPr>
-              <w:t xml:space="preserve">SAR 29.5m</w:t>
+              <w:t xml:space="preserve">Logistics SaaS falls within the Technology &amp; Consumer mandate.</w:t>
             </w:r>
           </w:p>
         </w:tc>
@@ -1410,7 +1345,7 @@
       <w:tr>
         <w:tc>
           <w:tcPr>
-            <w:tcW w:type="pct" w:w="40%"/>
+            <w:tcW w:type="pct" w:w="22%"/>
             <w:shd w:fill="FBF9F4" w:color="auto" w:val="clear"/>
             <w:tcMar>
               <w:top w:type="dxa" w:w="70"/>
@@ -1433,13 +1368,13 @@
                 <w:sz w:val="19"/>
                 <w:szCs w:val="19"/>
               </w:rPr>
-              <w:t xml:space="preserve">YoY ARR growth</w:t>
-            </w:r>
-          </w:p>
-        </w:tc>
-        <w:tc>
-          <w:tcPr>
-            <w:tcW w:type="pct" w:w="30%"/>
+              <w:t xml:space="preserve">Ticket vs mandate</w:t>
+            </w:r>
+          </w:p>
+        </w:tc>
+        <w:tc>
+          <w:tcPr>
+            <w:tcW w:type="pct" w:w="12%"/>
             <w:shd w:fill="FBF9F4" w:color="auto" w:val="clear"/>
             <w:tcMar>
               <w:top w:type="dxa" w:w="70"/>
@@ -1462,13 +1397,13 @@
                 <w:sz w:val="19"/>
                 <w:szCs w:val="19"/>
               </w:rPr>
-              <w:t xml:space="preserve">–</w:t>
-            </w:r>
-          </w:p>
-        </w:tc>
-        <w:tc>
-          <w:tcPr>
-            <w:tcW w:type="pct" w:w="30%"/>
+              <w:t xml:space="preserve">PASS</w:t>
+            </w:r>
+          </w:p>
+        </w:tc>
+        <w:tc>
+          <w:tcPr>
+            <w:tcW w:type="pct" w:w="66%"/>
             <w:shd w:fill="FBF9F4" w:color="auto" w:val="clear"/>
             <w:tcMar>
               <w:top w:type="dxa" w:w="70"/>
@@ -1491,7 +1426,7 @@
                 <w:sz w:val="19"/>
                 <w:szCs w:val="19"/>
               </w:rPr>
-              <w:t xml:space="preserve">62%</w:t>
+              <w:t xml:space="preserve">SAR 40M ask sits within the SAR 20-60M ticket band.</w:t>
             </w:r>
           </w:p>
         </w:tc>
@@ -1499,35 +1434,35 @@
       <w:tr>
         <w:tc>
           <w:tcPr>
-            <w:tcW w:type="pct" w:w="40%"/>
-            <w:tcMar>
-              <w:top w:type="dxa" w:w="70"/>
-              <w:left w:type="dxa" w:w="110"/>
-              <w:bottom w:type="dxa" w:w="70"/>
-              <w:right w:type="dxa" w:w="110"/>
-            </w:tcMar>
-            <w:vAlign w:val="center"/>
-          </w:tcPr>
-          <w:p>
-            <w:pPr>
-              <w:jc w:val="left"/>
-            </w:pPr>
-            <w:r>
-              <w:rPr>
-                <w:rFonts w:ascii="Arial" w:cs="Arial" w:eastAsia="Arial" w:hAnsi="Arial"/>
-                <w:b w:val="false"/>
-                <w:bCs w:val="false"/>
-                <w:color w:val="2A2620"/>
-                <w:sz w:val="19"/>
-                <w:szCs w:val="19"/>
-              </w:rPr>
-              <w:t xml:space="preserve">Gross margin</w:t>
-            </w:r>
-          </w:p>
-        </w:tc>
-        <w:tc>
-          <w:tcPr>
-            <w:tcW w:type="pct" w:w="30%"/>
+            <w:tcW w:type="pct" w:w="22%"/>
+            <w:tcMar>
+              <w:top w:type="dxa" w:w="70"/>
+              <w:left w:type="dxa" w:w="110"/>
+              <w:bottom w:type="dxa" w:w="70"/>
+              <w:right w:type="dxa" w:w="110"/>
+            </w:tcMar>
+            <w:vAlign w:val="center"/>
+          </w:tcPr>
+          <w:p>
+            <w:pPr>
+              <w:jc w:val="left"/>
+            </w:pPr>
+            <w:r>
+              <w:rPr>
+                <w:rFonts w:ascii="Arial" w:cs="Arial" w:eastAsia="Arial" w:hAnsi="Arial"/>
+                <w:b w:val="false"/>
+                <w:bCs w:val="false"/>
+                <w:color w:val="2A2620"/>
+                <w:sz w:val="19"/>
+                <w:szCs w:val="19"/>
+              </w:rPr>
+              <w:t xml:space="preserve">Stage fit</w:t>
+            </w:r>
+          </w:p>
+        </w:tc>
+        <w:tc>
+          <w:tcPr>
+            <w:tcW w:type="pct" w:w="12%"/>
             <w:tcMar>
               <w:top w:type="dxa" w:w="70"/>
               <w:left w:type="dxa" w:w="110"/>
@@ -1549,13 +1484,13 @@
                 <w:sz w:val="19"/>
                 <w:szCs w:val="19"/>
               </w:rPr>
-              <w:t xml:space="preserve">68%</w:t>
-            </w:r>
-          </w:p>
-        </w:tc>
-        <w:tc>
-          <w:tcPr>
-            <w:tcW w:type="pct" w:w="30%"/>
+              <w:t xml:space="preserve">PASS</w:t>
+            </w:r>
+          </w:p>
+        </w:tc>
+        <w:tc>
+          <w:tcPr>
+            <w:tcW w:type="pct" w:w="66%"/>
             <w:tcMar>
               <w:top w:type="dxa" w:w="70"/>
               <w:left w:type="dxa" w:w="110"/>
@@ -1577,7 +1512,7 @@
                 <w:sz w:val="19"/>
                 <w:szCs w:val="19"/>
               </w:rPr>
-              <w:t xml:space="preserve">71%</w:t>
+              <w:t xml:space="preserve">Series B falls within the mandated Series A-C stage window.</w:t>
             </w:r>
           </w:p>
         </w:tc>
@@ -1585,7 +1520,7 @@
       <w:tr>
         <w:tc>
           <w:tcPr>
-            <w:tcW w:type="pct" w:w="40%"/>
+            <w:tcW w:type="pct" w:w="22%"/>
             <w:shd w:fill="FBF9F4" w:color="auto" w:val="clear"/>
             <w:tcMar>
               <w:top w:type="dxa" w:w="70"/>
@@ -1608,13 +1543,13 @@
                 <w:sz w:val="19"/>
                 <w:szCs w:val="19"/>
               </w:rPr>
-              <w:t xml:space="preserve">Net revenue retention (NRR)</w:t>
-            </w:r>
-          </w:p>
-        </w:tc>
-        <w:tc>
-          <w:tcPr>
-            <w:tcW w:type="pct" w:w="30%"/>
+              <w:t xml:space="preserve">Compliance pre-screen</w:t>
+            </w:r>
+          </w:p>
+        </w:tc>
+        <w:tc>
+          <w:tcPr>
+            <w:tcW w:type="pct" w:w="12%"/>
             <w:shd w:fill="FBF9F4" w:color="auto" w:val="clear"/>
             <w:tcMar>
               <w:top w:type="dxa" w:w="70"/>
@@ -1637,13 +1572,13 @@
                 <w:sz w:val="19"/>
                 <w:szCs w:val="19"/>
               </w:rPr>
-              <w:t xml:space="preserve">118%</w:t>
-            </w:r>
-          </w:p>
-        </w:tc>
-        <w:tc>
-          <w:tcPr>
-            <w:tcW w:type="pct" w:w="30%"/>
+              <w:t xml:space="preserve">PASS</w:t>
+            </w:r>
+          </w:p>
+        </w:tc>
+        <w:tc>
+          <w:tcPr>
+            <w:tcW w:type="pct" w:w="66%"/>
             <w:shd w:fill="FBF9F4" w:color="auto" w:val="clear"/>
             <w:tcMar>
               <w:top w:type="dxa" w:w="70"/>
@@ -1666,7 +1601,7 @@
                 <w:sz w:val="19"/>
                 <w:szCs w:val="19"/>
               </w:rPr>
-              <w:t xml:space="preserve">124%</w:t>
+              <w:t xml:space="preserve">Business activity eligible; no leverage red flags at pre-screen.</w:t>
             </w:r>
           </w:p>
         </w:tc>
@@ -1674,35 +1609,35 @@
       <w:tr>
         <w:tc>
           <w:tcPr>
-            <w:tcW w:type="pct" w:w="40%"/>
-            <w:tcMar>
-              <w:top w:type="dxa" w:w="70"/>
-              <w:left w:type="dxa" w:w="110"/>
-              <w:bottom w:type="dxa" w:w="70"/>
-              <w:right w:type="dxa" w:w="110"/>
-            </w:tcMar>
-            <w:vAlign w:val="center"/>
-          </w:tcPr>
-          <w:p>
-            <w:pPr>
-              <w:jc w:val="left"/>
-            </w:pPr>
-            <w:r>
-              <w:rPr>
-                <w:rFonts w:ascii="Arial" w:cs="Arial" w:eastAsia="Arial" w:hAnsi="Arial"/>
-                <w:b w:val="false"/>
-                <w:bCs w:val="false"/>
-                <w:color w:val="2A2620"/>
-                <w:sz w:val="19"/>
-                <w:szCs w:val="19"/>
-              </w:rPr>
-              <w:t xml:space="preserve">Logo count (active customers)</w:t>
-            </w:r>
-          </w:p>
-        </w:tc>
-        <w:tc>
-          <w:tcPr>
-            <w:tcW w:type="pct" w:w="30%"/>
+            <w:tcW w:type="pct" w:w="22%"/>
+            <w:tcMar>
+              <w:top w:type="dxa" w:w="70"/>
+              <w:left w:type="dxa" w:w="110"/>
+              <w:bottom w:type="dxa" w:w="70"/>
+              <w:right w:type="dxa" w:w="110"/>
+            </w:tcMar>
+            <w:vAlign w:val="center"/>
+          </w:tcPr>
+          <w:p>
+            <w:pPr>
+              <w:jc w:val="left"/>
+            </w:pPr>
+            <w:r>
+              <w:rPr>
+                <w:rFonts w:ascii="Arial" w:cs="Arial" w:eastAsia="Arial" w:hAnsi="Arial"/>
+                <w:b w:val="false"/>
+                <w:bCs w:val="false"/>
+                <w:color w:val="2A2620"/>
+                <w:sz w:val="19"/>
+                <w:szCs w:val="19"/>
+              </w:rPr>
+              <w:t xml:space="preserve">Concentration</w:t>
+            </w:r>
+          </w:p>
+        </w:tc>
+        <w:tc>
+          <w:tcPr>
+            <w:tcW w:type="pct" w:w="12%"/>
             <w:tcMar>
               <w:top w:type="dxa" w:w="70"/>
               <w:left w:type="dxa" w:w="110"/>
@@ -1724,13 +1659,13 @@
                 <w:sz w:val="19"/>
                 <w:szCs w:val="19"/>
               </w:rPr>
-              <w:t xml:space="preserve">34</w:t>
-            </w:r>
-          </w:p>
-        </w:tc>
-        <w:tc>
-          <w:tcPr>
-            <w:tcW w:type="pct" w:w="30%"/>
+              <w:t xml:space="preserve">WARN</w:t>
+            </w:r>
+          </w:p>
+        </w:tc>
+        <w:tc>
+          <w:tcPr>
+            <w:tcW w:type="pct" w:w="66%"/>
             <w:tcMar>
               <w:top w:type="dxa" w:w="70"/>
               <w:left w:type="dxa" w:w="110"/>
@@ -1752,7 +1687,7 @@
                 <w:sz w:val="19"/>
                 <w:szCs w:val="19"/>
               </w:rPr>
-              <w:t xml:space="preserve">52</w:t>
+              <w:t xml:space="preserve">Technology &amp; Consumer sector exposure at 8.5% of AUM; a SAR 40M ticket (2.0% of AUM) would bring post-deal sector exposure to 10.5%, above the 10% cap.</w:t>
             </w:r>
           </w:p>
         </w:tc>
@@ -1760,7 +1695,7 @@
       <w:tr>
         <w:tc>
           <w:tcPr>
-            <w:tcW w:type="pct" w:w="40%"/>
+            <w:tcW w:type="pct" w:w="22%"/>
             <w:shd w:fill="FBF9F4" w:color="auto" w:val="clear"/>
             <w:tcMar>
               <w:top w:type="dxa" w:w="70"/>
@@ -1783,13 +1718,13 @@
                 <w:sz w:val="19"/>
                 <w:szCs w:val="19"/>
               </w:rPr>
-              <w:t xml:space="preserve">Monthly cash burn (avg.)</w:t>
-            </w:r>
-          </w:p>
-        </w:tc>
-        <w:tc>
-          <w:tcPr>
-            <w:tcW w:type="pct" w:w="30%"/>
+              <w:t xml:space="preserve">Red flags</w:t>
+            </w:r>
+          </w:p>
+        </w:tc>
+        <w:tc>
+          <w:tcPr>
+            <w:tcW w:type="pct" w:w="12%"/>
             <w:shd w:fill="FBF9F4" w:color="auto" w:val="clear"/>
             <w:tcMar>
               <w:top w:type="dxa" w:w="70"/>
@@ -1812,13 +1747,13 @@
                 <w:sz w:val="19"/>
                 <w:szCs w:val="19"/>
               </w:rPr>
-              <w:t xml:space="preserve">SAR 1.4m</w:t>
-            </w:r>
-          </w:p>
-        </w:tc>
-        <w:tc>
-          <w:tcPr>
-            <w:tcW w:type="pct" w:w="30%"/>
+              <w:t xml:space="preserve">PASS</w:t>
+            </w:r>
+          </w:p>
+        </w:tc>
+        <w:tc>
+          <w:tcPr>
+            <w:tcW w:type="pct" w:w="66%"/>
             <w:shd w:fill="FBF9F4" w:color="auto" w:val="clear"/>
             <w:tcMar>
               <w:top w:type="dxa" w:w="70"/>
@@ -1841,93 +1776,7 @@
                 <w:sz w:val="19"/>
                 <w:szCs w:val="19"/>
               </w:rPr>
-              <w:t xml:space="preserve">–</w:t>
-            </w:r>
-          </w:p>
-        </w:tc>
-      </w:tr>
-      <w:tr>
-        <w:tc>
-          <w:tcPr>
-            <w:tcW w:type="pct" w:w="40%"/>
-            <w:tcMar>
-              <w:top w:type="dxa" w:w="70"/>
-              <w:left w:type="dxa" w:w="110"/>
-              <w:bottom w:type="dxa" w:w="70"/>
-              <w:right w:type="dxa" w:w="110"/>
-            </w:tcMar>
-            <w:vAlign w:val="center"/>
-          </w:tcPr>
-          <w:p>
-            <w:pPr>
-              <w:jc w:val="left"/>
-            </w:pPr>
-            <w:r>
-              <w:rPr>
-                <w:rFonts w:ascii="Arial" w:cs="Arial" w:eastAsia="Arial" w:hAnsi="Arial"/>
-                <w:b w:val="false"/>
-                <w:bCs w:val="false"/>
-                <w:color w:val="2A2620"/>
-                <w:sz w:val="19"/>
-                <w:szCs w:val="19"/>
-              </w:rPr>
-              <w:t xml:space="preserve">Cash runway at close (post-round)</w:t>
-            </w:r>
-          </w:p>
-        </w:tc>
-        <w:tc>
-          <w:tcPr>
-            <w:tcW w:type="pct" w:w="30%"/>
-            <w:tcMar>
-              <w:top w:type="dxa" w:w="70"/>
-              <w:left w:type="dxa" w:w="110"/>
-              <w:bottom w:type="dxa" w:w="70"/>
-              <w:right w:type="dxa" w:w="110"/>
-            </w:tcMar>
-            <w:vAlign w:val="center"/>
-          </w:tcPr>
-          <w:p>
-            <w:pPr>
-              <w:jc w:val="center"/>
-            </w:pPr>
-            <w:r>
-              <w:rPr>
-                <w:rFonts w:ascii="Arial" w:cs="Arial" w:eastAsia="Arial" w:hAnsi="Arial"/>
-                <w:b w:val="false"/>
-                <w:bCs w:val="false"/>
-                <w:color w:val="2A2620"/>
-                <w:sz w:val="19"/>
-                <w:szCs w:val="19"/>
-              </w:rPr>
-              <w:t xml:space="preserve">–</w:t>
-            </w:r>
-          </w:p>
-        </w:tc>
-        <w:tc>
-          <w:tcPr>
-            <w:tcW w:type="pct" w:w="30%"/>
-            <w:tcMar>
-              <w:top w:type="dxa" w:w="70"/>
-              <w:left w:type="dxa" w:w="110"/>
-              <w:bottom w:type="dxa" w:w="70"/>
-              <w:right w:type="dxa" w:w="110"/>
-            </w:tcMar>
-            <w:vAlign w:val="center"/>
-          </w:tcPr>
-          <w:p>
-            <w:pPr>
-              <w:jc w:val="center"/>
-            </w:pPr>
-            <w:r>
-              <w:rPr>
-                <w:rFonts w:ascii="Arial" w:cs="Arial" w:eastAsia="Arial" w:hAnsi="Arial"/>
-                <w:b w:val="false"/>
-                <w:bCs w:val="false"/>
-                <w:color w:val="2A2620"/>
-                <w:sz w:val="19"/>
-                <w:szCs w:val="19"/>
-              </w:rPr>
-              <w:t xml:space="preserve">~24 months</w:t>
+              <w:t xml:space="preserve">No sanctions, conflicts-of-interest, or related-party issues identified.</w:t>
             </w:r>
           </w:p>
         </w:tc>
@@ -1946,27 +1795,26 @@
           <w:sz w:val="17"/>
           <w:szCs w:val="17"/>
         </w:rPr>
-        <w:t xml:space="preserve">Source: Darb Data Room · Screening Summary, p.3. Company-reported and unaudited at screening stage.</w:t>
-      </w:r>
-    </w:p>
-    <w:p>
-      <w:pPr>
-        <w:pStyle w:val="Heading1"/>
+        <w:t xml:space="preserve">Source: Lunar IC Charter &amp; Investment Mandate, p.3; Source: Lunar IC Charter &amp; Investment Mandate, p.4; Source: Lunar IC Charter &amp; Investment Mandate, p.5.</w:t>
+      </w:r>
+    </w:p>
+    <w:p>
+      <w:pPr>
         <w:pBdr>
-          <w:bottom w:val="single" w:color="B08D2A" w:sz="10"/>
+          <w:bottom w:val="single" w:color="D8D2C4" w:sz="4"/>
         </w:pBdr>
-        <w:spacing w:after="140" w:before="420"/>
-      </w:pPr>
-      <w:r>
-        <w:rPr>
-          <w:rFonts w:ascii="Georgia" w:cs="Georgia" w:eastAsia="Georgia" w:hAnsi="Georgia"/>
+        <w:spacing w:after="90" w:before="220"/>
+      </w:pPr>
+      <w:r>
+        <w:rPr>
+          <w:rFonts w:ascii="Arial" w:cs="Arial" w:eastAsia="Arial" w:hAnsi="Arial"/>
           <w:b/>
           <w:bCs/>
-          <w:color w:val="2A2620"/>
-          <w:sz w:val="32"/>
-          <w:szCs w:val="32"/>
-        </w:rPr>
-        <w:t xml:space="preserve">Use of Proceeds</w:t>
+          <w:color w:val="514B40"/>
+          <w:sz w:val="24"/>
+          <w:szCs w:val="24"/>
+        </w:rPr>
+        <w:t xml:space="preserve">Concentration detail</w:t>
       </w:r>
     </w:p>
     <w:p>
@@ -1981,7 +1829,7 @@
           <w:sz w:val="21"/>
           <w:szCs w:val="21"/>
         </w:rPr>
-        <w:t xml:space="preserve">Management indicates the SAR 40M Series B is earmarked roughly 55% for go-to-market expansion (enterprise sales, quick-commerce partnerships), 30% for product and engineering headcount, and 15% for working capital and runway extension.</w:t>
+        <w:t xml:space="preserve">The Technology &amp; Consumer sector bucket currently sits at 8.5% of firm AUM. A SAR 40M ticket represents a further 2.0% of AUM, bringing post-deal sector exposure to 10.5%, above the Charter's 10% sector concentration cap. Per the Charter, this does not automatically fail the screen, but it requires explicit IC acknowledgement of the mandate breach before the deal may advance.</w:t>
       </w:r>
     </w:p>
     <w:p>
@@ -1997,31 +1845,14 @@
           <w:sz w:val="17"/>
           <w:szCs w:val="17"/>
         </w:rPr>
-        <w:t xml:space="preserve">Source: Darb Data Room · Screening Summary, p.3</w:t>
-      </w:r>
-    </w:p>
-    <w:p>
-      <w:pPr>
-        <w:pStyle w:val="Heading1"/>
+        <w:t xml:space="preserve">Source: Lunar Current Portfolio Snapshot, p.1; Source: Lunar IC Charter &amp; Investment Mandate, p.4.</w:t>
+      </w:r>
+    </w:p>
+    <w:p>
+      <w:pPr>
         <w:pBdr>
-          <w:bottom w:val="single" w:color="B08D2A" w:sz="10"/>
+          <w:bottom w:val="single" w:color="D8D2C4" w:sz="4"/>
         </w:pBdr>
-        <w:spacing w:after="140" w:before="420"/>
-      </w:pPr>
-      <w:r>
-        <w:rPr>
-          <w:rFonts w:ascii="Georgia" w:cs="Georgia" w:eastAsia="Georgia" w:hAnsi="Georgia"/>
-          <w:b/>
-          <w:bCs/>
-          <w:color w:val="2A2620"/>
-          <w:sz w:val="32"/>
-          <w:szCs w:val="32"/>
-        </w:rPr>
-        <w:t xml:space="preserve">Founding Team</w:t>
-      </w:r>
-    </w:p>
-    <w:p>
-      <w:pPr>
         <w:spacing w:after="90" w:before="220"/>
       </w:pPr>
       <w:r>
@@ -2033,7 +1864,7 @@
           <w:sz w:val="24"/>
           <w:szCs w:val="24"/>
         </w:rPr>
-        <w:t xml:space="preserve">Faisal Al-Otaibi, Co-founder &amp; CEO</w:t>
+        <w:t xml:space="preserve">Red flags</w:t>
       </w:r>
     </w:p>
     <w:p>
@@ -2048,11 +1879,41 @@
           <w:sz w:val="21"/>
           <w:szCs w:val="21"/>
         </w:rPr>
-        <w:t xml:space="preserve">Former operations lead at a Riyadh-based quick-commerce platform, where he built the last-mile dispatch system that Darb's routing engine is descended from. Industrial engineering background, King Saud University.</w:t>
-      </w:r>
-    </w:p>
-    <w:p>
-      <w:pPr>
+        <w:t xml:space="preserve">No sanctions, conflicts-of-interest, or related-party issues were identified at the pre-screen stage.</w:t>
+      </w:r>
+    </w:p>
+    <w:p>
+      <w:pPr>
+        <w:spacing w:after="0" w:before="220"/>
+      </w:pPr>
+    </w:p>
+    <w:p>
+      <w:pPr>
+        <w:pStyle w:val="Heading1"/>
+        <w:pBdr>
+          <w:bottom w:val="single" w:color="B08D2A" w:sz="12"/>
+        </w:pBdr>
+        <w:shd w:fill="2A2620" w:color="auto" w:val="clear"/>
+        <w:spacing w:after="240" w:before="90"/>
+        <w:ind w:left="172"/>
+      </w:pPr>
+      <w:r>
+        <w:rPr>
+          <w:rFonts w:ascii="Georgia" w:cs="Georgia" w:eastAsia="Georgia" w:hAnsi="Georgia"/>
+          <w:b/>
+          <w:bCs/>
+          <w:color w:val="F5F1E6"/>
+          <w:sz w:val="28"/>
+          <w:szCs w:val="28"/>
+        </w:rPr>
+        <w:t xml:space="preserve">Key Strengths and Concerns</w:t>
+      </w:r>
+    </w:p>
+    <w:p>
+      <w:pPr>
+        <w:pBdr>
+          <w:bottom w:val="single" w:color="D8D2C4" w:sz="4"/>
+        </w:pBdr>
         <w:spacing w:after="90" w:before="220"/>
       </w:pPr>
       <w:r>
@@ -2064,26 +1925,138 @@
           <w:sz w:val="24"/>
           <w:szCs w:val="24"/>
         </w:rPr>
-        <w:t xml:space="preserve">Nourah Al-Harbi, Co-founder &amp; CTO</w:t>
-      </w:r>
-    </w:p>
-    <w:p>
-      <w:pPr>
-        <w:spacing w:after="160" w:line="264"/>
+        <w:t xml:space="preserve">Key strengths</w:t>
+      </w:r>
+    </w:p>
+    <w:p>
+      <w:pPr>
+        <w:pStyle w:val="ListParagraph"/>
+        <w:numPr>
+          <w:ilvl w:val="0"/>
+          <w:numId w:val="1"/>
+        </w:numPr>
+        <w:spacing w:after="110" w:line="256"/>
         <w:jc w:val="both"/>
       </w:pPr>
       <w:r>
         <w:rPr>
           <w:rFonts w:ascii="Arial" w:cs="Arial" w:eastAsia="Arial" w:hAnsi="Arial"/>
-          <w:color w:val="2A2620"/>
-          <w:sz w:val="21"/>
-          <w:szCs w:val="21"/>
-        </w:rPr>
-        <w:t xml:space="preserve">Previously a senior backend engineer on a regional ride-hailing platform's logistics team. Led Darb's API and carrier-integration architecture from day one. Computer science background, KFUPM.</w:t>
-      </w:r>
-    </w:p>
-    <w:p>
-      <w:pPr>
+          <w:b/>
+          <w:bCs/>
+          <w:color w:val="2A2620"/>
+          <w:sz w:val="21"/>
+          <w:szCs w:val="21"/>
+        </w:rPr>
+        <w:t xml:space="preserve">Subscription SaaS on an asset-light model: </w:t>
+      </w:r>
+      <w:r>
+        <w:rPr>
+          <w:rFonts w:ascii="Arial" w:cs="Arial" w:eastAsia="Arial" w:hAnsi="Arial"/>
+          <w:color w:val="2A2620"/>
+          <w:sz w:val="21"/>
+          <w:szCs w:val="21"/>
+        </w:rPr>
+        <w:t xml:space="preserve">The platform is deployed as subscription software layered on the customer's existing fleet, avoiding the asset-heavy economics of an owned-fleet delivery business; route optimization, fleet operations, carrier integrations and analytics sit in one dashboard and API layer.</w:t>
+      </w:r>
+    </w:p>
+    <w:p>
+      <w:pPr>
+        <w:pStyle w:val="ListParagraph"/>
+        <w:numPr>
+          <w:ilvl w:val="0"/>
+          <w:numId w:val="1"/>
+        </w:numPr>
+        <w:spacing w:after="110" w:line="256"/>
+        <w:jc w:val="both"/>
+      </w:pPr>
+      <w:r>
+        <w:rPr>
+          <w:rFonts w:ascii="Arial" w:cs="Arial" w:eastAsia="Arial" w:hAnsi="Arial"/>
+          <w:b/>
+          <w:bCs/>
+          <w:color w:val="2A2620"/>
+          <w:sz w:val="21"/>
+          <w:szCs w:val="21"/>
+        </w:rPr>
+        <w:t xml:space="preserve">Reported net revenue retention above 100%: </w:t>
+      </w:r>
+      <w:r>
+        <w:rPr>
+          <w:rFonts w:ascii="Arial" w:cs="Arial" w:eastAsia="Arial" w:hAnsi="Arial"/>
+          <w:color w:val="2A2620"/>
+          <w:sz w:val="21"/>
+          <w:szCs w:val="21"/>
+        </w:rPr>
+        <w:t xml:space="preserve">Company-reported NRR of 118% in FY2025A and 124% guided for FY2026E indicates expansion within the existing customer base; durability has not been independently tested and is an open diligence item.</w:t>
+      </w:r>
+    </w:p>
+    <w:p>
+      <w:pPr>
+        <w:pStyle w:val="ListParagraph"/>
+        <w:numPr>
+          <w:ilvl w:val="0"/>
+          <w:numId w:val="1"/>
+        </w:numPr>
+        <w:spacing w:after="110" w:line="256"/>
+        <w:jc w:val="both"/>
+      </w:pPr>
+      <w:r>
+        <w:rPr>
+          <w:rFonts w:ascii="Arial" w:cs="Arial" w:eastAsia="Arial" w:hAnsi="Arial"/>
+          <w:b/>
+          <w:bCs/>
+          <w:color w:val="2A2620"/>
+          <w:sz w:val="21"/>
+          <w:szCs w:val="21"/>
+        </w:rPr>
+        <w:t xml:space="preserve">Reported growth with logo expansion: </w:t>
+      </w:r>
+      <w:r>
+        <w:rPr>
+          <w:rFonts w:ascii="Arial" w:cs="Arial" w:eastAsia="Arial" w:hAnsi="Arial"/>
+          <w:color w:val="2A2620"/>
+          <w:sz w:val="21"/>
+          <w:szCs w:val="21"/>
+        </w:rPr>
+        <w:t xml:space="preserve">ARR is reported at SAR 18.2m for FY2025A with SAR 29.5m guided for FY2026E (+62% YoY), on logo growth from 34 to 52 active customers, at a 68% reported gross margin.</w:t>
+      </w:r>
+    </w:p>
+    <w:p>
+      <w:pPr>
+        <w:pStyle w:val="ListParagraph"/>
+        <w:numPr>
+          <w:ilvl w:val="0"/>
+          <w:numId w:val="1"/>
+        </w:numPr>
+        <w:spacing w:after="110" w:line="256"/>
+        <w:jc w:val="both"/>
+      </w:pPr>
+      <w:r>
+        <w:rPr>
+          <w:rFonts w:ascii="Arial" w:cs="Arial" w:eastAsia="Arial" w:hAnsi="Arial"/>
+          <w:b/>
+          <w:bCs/>
+          <w:color w:val="2A2620"/>
+          <w:sz w:val="21"/>
+          <w:szCs w:val="21"/>
+        </w:rPr>
+        <w:t xml:space="preserve">Policy-aligned market backdrop, as framed by management: </w:t>
+      </w:r>
+      <w:r>
+        <w:rPr>
+          <w:rFonts w:ascii="Arial" w:cs="Arial" w:eastAsia="Arial" w:hAnsi="Arial"/>
+          <w:color w:val="2A2620"/>
+          <w:sz w:val="21"/>
+          <w:szCs w:val="21"/>
+        </w:rPr>
+        <w:t xml:space="preserve">Management frames the opportunity against growth in Saudi e-commerce and quick-commerce delivery volumes and the logistics-digitization push under Vision 2030's transport and logistics pillar; this is management's framing, presented as a judgment to be tested in diligence, not an independently verified market estimate.</w:t>
+      </w:r>
+    </w:p>
+    <w:p>
+      <w:pPr>
+        <w:pBdr>
+          <w:bottom w:val="single" w:color="D8D2C4" w:sz="4"/>
+        </w:pBdr>
         <w:spacing w:after="90" w:before="220"/>
       </w:pPr>
       <w:r>
@@ -2095,22 +2068,162 @@
           <w:sz w:val="24"/>
           <w:szCs w:val="24"/>
         </w:rPr>
-        <w:t xml:space="preserve">Khalid Al-Dossari, Co-founder &amp; Head of Revenue</w:t>
-      </w:r>
-    </w:p>
-    <w:p>
-      <w:pPr>
-        <w:spacing w:after="160" w:line="264"/>
+        <w:t xml:space="preserve">Key concerns</w:t>
+      </w:r>
+    </w:p>
+    <w:p>
+      <w:pPr>
+        <w:pStyle w:val="ListParagraph"/>
+        <w:numPr>
+          <w:ilvl w:val="0"/>
+          <w:numId w:val="1"/>
+        </w:numPr>
+        <w:spacing w:after="110" w:line="256"/>
         <w:jc w:val="both"/>
       </w:pPr>
       <w:r>
         <w:rPr>
           <w:rFonts w:ascii="Arial" w:cs="Arial" w:eastAsia="Arial" w:hAnsi="Arial"/>
-          <w:color w:val="2A2620"/>
-          <w:sz w:val="21"/>
-          <w:szCs w:val="21"/>
-        </w:rPr>
-        <w:t xml:space="preserve">Ten years in enterprise SaaS sales across the GCC prior to Darb, most recently running mid-market sales for a regional fleet-management vendor. Owns Darb's enterprise and quick-commerce partnership pipeline.</w:t>
+          <w:b/>
+          <w:bCs/>
+          <w:color w:val="2A2620"/>
+          <w:sz w:val="21"/>
+          <w:szCs w:val="21"/>
+        </w:rPr>
+        <w:t xml:space="preserve">Unaudited, company-reported figures: </w:t>
+      </w:r>
+      <w:r>
+        <w:rPr>
+          <w:rFonts w:ascii="Arial" w:cs="Arial" w:eastAsia="Arial" w:hAnsi="Arial"/>
+          <w:color w:val="2A2620"/>
+          <w:sz w:val="21"/>
+          <w:szCs w:val="21"/>
+        </w:rPr>
+        <w:t xml:space="preserve">All financial figures in this memorandum are company-reported and unaudited; full audited or reviewed statements for FY2023-FY2025 are pending under NDA and are a required diligence item before any ticket is issued.</w:t>
+      </w:r>
+    </w:p>
+    <w:p>
+      <w:pPr>
+        <w:pStyle w:val="ListParagraph"/>
+        <w:numPr>
+          <w:ilvl w:val="0"/>
+          <w:numId w:val="1"/>
+        </w:numPr>
+        <w:spacing w:after="110" w:line="256"/>
+        <w:jc w:val="both"/>
+      </w:pPr>
+      <w:r>
+        <w:rPr>
+          <w:rFonts w:ascii="Arial" w:cs="Arial" w:eastAsia="Arial" w:hAnsi="Arial"/>
+          <w:b/>
+          <w:bCs/>
+          <w:color w:val="2A2620"/>
+          <w:sz w:val="21"/>
+          <w:szCs w:val="21"/>
+        </w:rPr>
+        <w:t xml:space="preserve">Customer concentration unknown: </w:t>
+      </w:r>
+      <w:r>
+        <w:rPr>
+          <w:rFonts w:ascii="Arial" w:cs="Arial" w:eastAsia="Arial" w:hAnsi="Arial"/>
+          <w:color w:val="2A2620"/>
+          <w:sz w:val="21"/>
+          <w:szCs w:val="21"/>
+        </w:rPr>
+        <w:t xml:space="preserve">Concentration cannot be assessed until the full data room (customer contracts and cohort-level retention) is reviewed; the segment split shared at screening is anonymized.</w:t>
+      </w:r>
+    </w:p>
+    <w:p>
+      <w:pPr>
+        <w:pStyle w:val="ListParagraph"/>
+        <w:numPr>
+          <w:ilvl w:val="0"/>
+          <w:numId w:val="1"/>
+        </w:numPr>
+        <w:spacing w:after="110" w:line="256"/>
+        <w:jc w:val="both"/>
+      </w:pPr>
+      <w:r>
+        <w:rPr>
+          <w:rFonts w:ascii="Arial" w:cs="Arial" w:eastAsia="Arial" w:hAnsi="Arial"/>
+          <w:b/>
+          <w:bCs/>
+          <w:color w:val="2A2620"/>
+          <w:sz w:val="21"/>
+          <w:szCs w:val="21"/>
+        </w:rPr>
+        <w:t xml:space="preserve">Retention durability untested: </w:t>
+      </w:r>
+      <w:r>
+        <w:rPr>
+          <w:rFonts w:ascii="Arial" w:cs="Arial" w:eastAsia="Arial" w:hAnsi="Arial"/>
+          <w:color w:val="2A2620"/>
+          <w:sz w:val="21"/>
+          <w:szCs w:val="21"/>
+        </w:rPr>
+        <w:t xml:space="preserve">Net revenue retention at 118-124% has not been independently tested against cohort-level churn data.</w:t>
+      </w:r>
+    </w:p>
+    <w:p>
+      <w:pPr>
+        <w:pStyle w:val="ListParagraph"/>
+        <w:numPr>
+          <w:ilvl w:val="0"/>
+          <w:numId w:val="1"/>
+        </w:numPr>
+        <w:spacing w:after="110" w:line="256"/>
+        <w:jc w:val="both"/>
+      </w:pPr>
+      <w:r>
+        <w:rPr>
+          <w:rFonts w:ascii="Arial" w:cs="Arial" w:eastAsia="Arial" w:hAnsi="Arial"/>
+          <w:b/>
+          <w:bCs/>
+          <w:color w:val="2A2620"/>
+          <w:sz w:val="21"/>
+          <w:szCs w:val="21"/>
+        </w:rPr>
+        <w:t xml:space="preserve">Competitive response from in-house tooling: </w:t>
+      </w:r>
+      <w:r>
+        <w:rPr>
+          <w:rFonts w:ascii="Arial" w:cs="Arial" w:eastAsia="Arial" w:hAnsi="Arial"/>
+          <w:color w:val="2A2620"/>
+          <w:sz w:val="21"/>
+          <w:szCs w:val="21"/>
+        </w:rPr>
+        <w:t xml:space="preserve">In-house dispatch tooling built by large logistics operators and quick-commerce platforms is management's stated primary competitive risk, not yet independently assessed.</w:t>
+      </w:r>
+    </w:p>
+    <w:p>
+      <w:pPr>
+        <w:pStyle w:val="ListParagraph"/>
+        <w:numPr>
+          <w:ilvl w:val="0"/>
+          <w:numId w:val="1"/>
+        </w:numPr>
+        <w:spacing w:after="110" w:line="256"/>
+        <w:jc w:val="both"/>
+      </w:pPr>
+      <w:r>
+        <w:rPr>
+          <w:rFonts w:ascii="Arial" w:cs="Arial" w:eastAsia="Arial" w:hAnsi="Arial"/>
+          <w:b/>
+          <w:bCs/>
+          <w:color w:val="2A2620"/>
+          <w:sz w:val="21"/>
+          <w:szCs w:val="21"/>
+        </w:rPr>
+        <w:t xml:space="preserve">Sector concentration flag: </w:t>
+      </w:r>
+      <w:r>
+        <w:rPr>
+          <w:rFonts w:ascii="Arial" w:cs="Arial" w:eastAsia="Arial" w:hAnsi="Arial"/>
+          <w:color w:val="2A2620"/>
+          <w:sz w:val="21"/>
+          <w:szCs w:val="21"/>
+        </w:rPr>
+        <w:t xml:space="preserve">Post-deal Technology &amp; Consumer exposure of 10.5% of AUM would sit above the Charter's 10% cap; the Charter requires explicit IC acknowledgement of the breach before the deal advances.</w:t>
       </w:r>
     </w:p>
     <w:p>
@@ -2126,27 +2239,53 @@
           <w:sz w:val="17"/>
           <w:szCs w:val="17"/>
         </w:rPr>
-        <w:t xml:space="preserve">Source: Darb Data Room · Screening Summary, p.4</w:t>
-      </w:r>
+        <w:t xml:space="preserve">Source: Darb Data Room · Screening Summary, p.3; Source: Darb Data Room · Screening Summary, p.6; Source: Lunar IC Charter &amp; Investment Mandate, p.4. Company-reported figures are unaudited at screening stage.</w:t>
+      </w:r>
+    </w:p>
+    <w:p>
+      <w:pPr>
+        <w:spacing w:after="0" w:before="220"/>
+      </w:pPr>
     </w:p>
     <w:p>
       <w:pPr>
         <w:pStyle w:val="Heading1"/>
         <w:pBdr>
-          <w:bottom w:val="single" w:color="B08D2A" w:sz="10"/>
+          <w:bottom w:val="single" w:color="B08D2A" w:sz="12"/>
         </w:pBdr>
-        <w:spacing w:after="140" w:before="420"/>
+        <w:shd w:fill="2A2620" w:color="auto" w:val="clear"/>
+        <w:spacing w:after="240" w:before="90"/>
+        <w:ind w:left="172"/>
       </w:pPr>
       <w:r>
         <w:rPr>
           <w:rFonts w:ascii="Georgia" w:cs="Georgia" w:eastAsia="Georgia" w:hAnsi="Georgia"/>
           <w:b/>
           <w:bCs/>
-          <w:color w:val="2A2620"/>
-          <w:sz w:val="32"/>
-          <w:szCs w:val="32"/>
-        </w:rPr>
-        <w:t xml:space="preserve">Mandate Screening vs the IC Charter</w:t>
+          <w:color w:val="F5F1E6"/>
+          <w:sz w:val="28"/>
+          <w:szCs w:val="28"/>
+        </w:rPr>
+        <w:t xml:space="preserve">Company and Market Overview</w:t>
+      </w:r>
+    </w:p>
+    <w:p>
+      <w:pPr>
+        <w:pBdr>
+          <w:bottom w:val="single" w:color="D8D2C4" w:sz="4"/>
+        </w:pBdr>
+        <w:spacing w:after="90" w:before="220"/>
+      </w:pPr>
+      <w:r>
+        <w:rPr>
+          <w:rFonts w:ascii="Arial" w:cs="Arial" w:eastAsia="Arial" w:hAnsi="Arial"/>
+          <w:b/>
+          <w:bCs/>
+          <w:color w:val="514B40"/>
+          <w:sz w:val="24"/>
+          <w:szCs w:val="24"/>
+        </w:rPr>
+        <w:t xml:space="preserve">Company overview</w:t>
       </w:r>
     </w:p>
     <w:p>
@@ -2161,7 +2300,326 @@
           <w:sz w:val="21"/>
           <w:szCs w:val="21"/>
         </w:rPr>
-        <w:t xml:space="preserve">The Screening Agent checked Darb against every Charter criterion that applies to a private growth-equity opportunity. Five criteria pass outright; sector concentration is flagged, not failed, per the Charter's own escalation rule.</w:t>
+        <w:t xml:space="preserve">Darb builds fleet- and route-optimization software for last-mile and middle-mile logistics operators in the Kingdom. The platform sits between shippers and carrier fleets, providing route planning, real-time tracking, proof-of-delivery, and carrier-performance analytics through a single dashboard and API layer. The product is deployed as subscription SaaS layered on the customer's existing fleet, avoiding the asset-heavy economics of an owned-fleet delivery business.</w:t>
+      </w:r>
+    </w:p>
+    <w:p>
+      <w:pPr>
+        <w:pBdr>
+          <w:bottom w:val="single" w:color="D8D2C4" w:sz="4"/>
+        </w:pBdr>
+        <w:spacing w:after="90" w:before="220"/>
+      </w:pPr>
+      <w:r>
+        <w:rPr>
+          <w:rFonts w:ascii="Arial" w:cs="Arial" w:eastAsia="Arial" w:hAnsi="Arial"/>
+          <w:b/>
+          <w:bCs/>
+          <w:color w:val="514B40"/>
+          <w:sz w:val="24"/>
+          <w:szCs w:val="24"/>
+        </w:rPr>
+        <w:t xml:space="preserve">Product surface</w:t>
+      </w:r>
+    </w:p>
+    <w:p>
+      <w:pPr>
+        <w:pStyle w:val="ListParagraph"/>
+        <w:numPr>
+          <w:ilvl w:val="0"/>
+          <w:numId w:val="1"/>
+        </w:numPr>
+        <w:spacing w:after="100" w:line="256"/>
+        <w:jc w:val="both"/>
+      </w:pPr>
+      <w:r>
+        <w:rPr>
+          <w:rFonts w:ascii="Arial" w:cs="Arial" w:eastAsia="Arial" w:hAnsi="Arial"/>
+          <w:color w:val="2A2620"/>
+          <w:sz w:val="21"/>
+          <w:szCs w:val="21"/>
+        </w:rPr>
+        <w:t xml:space="preserve">Route Optimization Engine, dynamic routing across driver fleets</w:t>
+      </w:r>
+    </w:p>
+    <w:p>
+      <w:pPr>
+        <w:pStyle w:val="ListParagraph"/>
+        <w:numPr>
+          <w:ilvl w:val="0"/>
+          <w:numId w:val="1"/>
+        </w:numPr>
+        <w:spacing w:after="100" w:line="256"/>
+        <w:jc w:val="both"/>
+      </w:pPr>
+      <w:r>
+        <w:rPr>
+          <w:rFonts w:ascii="Arial" w:cs="Arial" w:eastAsia="Arial" w:hAnsi="Arial"/>
+          <w:color w:val="2A2620"/>
+          <w:sz w:val="21"/>
+          <w:szCs w:val="21"/>
+        </w:rPr>
+        <w:t xml:space="preserve">Fleet Ops Dashboard, live tracking, proof-of-delivery, exception management</w:t>
+      </w:r>
+    </w:p>
+    <w:p>
+      <w:pPr>
+        <w:pStyle w:val="ListParagraph"/>
+        <w:numPr>
+          <w:ilvl w:val="0"/>
+          <w:numId w:val="1"/>
+        </w:numPr>
+        <w:spacing w:after="100" w:line="256"/>
+        <w:jc w:val="both"/>
+      </w:pPr>
+      <w:r>
+        <w:rPr>
+          <w:rFonts w:ascii="Arial" w:cs="Arial" w:eastAsia="Arial" w:hAnsi="Arial"/>
+          <w:color w:val="2A2620"/>
+          <w:sz w:val="21"/>
+          <w:szCs w:val="21"/>
+        </w:rPr>
+        <w:t xml:space="preserve">Carrier API, integration layer for third-party carrier networks and quick-commerce platforms</w:t>
+      </w:r>
+    </w:p>
+    <w:p>
+      <w:pPr>
+        <w:pStyle w:val="ListParagraph"/>
+        <w:numPr>
+          <w:ilvl w:val="0"/>
+          <w:numId w:val="1"/>
+        </w:numPr>
+        <w:spacing w:after="100" w:line="256"/>
+        <w:jc w:val="both"/>
+      </w:pPr>
+      <w:r>
+        <w:rPr>
+          <w:rFonts w:ascii="Arial" w:cs="Arial" w:eastAsia="Arial" w:hAnsi="Arial"/>
+          <w:color w:val="2A2620"/>
+          <w:sz w:val="21"/>
+          <w:szCs w:val="21"/>
+        </w:rPr>
+        <w:t xml:space="preserve">Analytics Suite, delivery SLA, cost-per-order, and carrier-performance reporting</w:t>
+      </w:r>
+    </w:p>
+    <w:p>
+      <w:pPr>
+        <w:pBdr>
+          <w:bottom w:val="single" w:color="D8D2C4" w:sz="4"/>
+        </w:pBdr>
+        <w:spacing w:after="90" w:before="220"/>
+      </w:pPr>
+      <w:r>
+        <w:rPr>
+          <w:rFonts w:ascii="Arial" w:cs="Arial" w:eastAsia="Arial" w:hAnsi="Arial"/>
+          <w:b/>
+          <w:bCs/>
+          <w:color w:val="514B40"/>
+          <w:sz w:val="24"/>
+          <w:szCs w:val="24"/>
+        </w:rPr>
+        <w:t xml:space="preserve">Market backdrop</w:t>
+      </w:r>
+    </w:p>
+    <w:p>
+      <w:pPr>
+        <w:spacing w:after="160" w:line="264"/>
+        <w:jc w:val="both"/>
+      </w:pPr>
+      <w:r>
+        <w:rPr>
+          <w:rFonts w:ascii="Arial" w:cs="Arial" w:eastAsia="Arial" w:hAnsi="Arial"/>
+          <w:color w:val="2A2620"/>
+          <w:sz w:val="21"/>
+          <w:szCs w:val="21"/>
+        </w:rPr>
+        <w:t xml:space="preserve">Management frames the opportunity against rapid growth in Saudi e-commerce and quick-commerce delivery volumes, and the broader push toward logistics-sector digitization under Vision 2030's transport and logistics pillar. This is management's framing of the opportunity, presented here as a judgment to be tested in diligence, not an independently verified market estimate.</w:t>
+      </w:r>
+    </w:p>
+    <w:p>
+      <w:pPr>
+        <w:spacing w:after="200" w:before="40"/>
+      </w:pPr>
+      <w:r>
+        <w:rPr>
+          <w:rFonts w:ascii="Arial" w:cs="Arial" w:eastAsia="Arial" w:hAnsi="Arial"/>
+          <w:i/>
+          <w:iCs/>
+          <w:color w:val="6B6455"/>
+          <w:sz w:val="17"/>
+          <w:szCs w:val="17"/>
+        </w:rPr>
+        <w:t xml:space="preserve">Source: Darb Data Room · Screening Summary, p.2</w:t>
+      </w:r>
+    </w:p>
+    <w:p>
+      <w:pPr>
+        <w:pBdr>
+          <w:bottom w:val="single" w:color="D8D2C4" w:sz="4"/>
+        </w:pBdr>
+        <w:spacing w:after="90" w:before="220"/>
+      </w:pPr>
+      <w:r>
+        <w:rPr>
+          <w:rFonts w:ascii="Arial" w:cs="Arial" w:eastAsia="Arial" w:hAnsi="Arial"/>
+          <w:b/>
+          <w:bCs/>
+          <w:color w:val="514B40"/>
+          <w:sz w:val="24"/>
+          <w:szCs w:val="24"/>
+        </w:rPr>
+        <w:t xml:space="preserve">Founding team</w:t>
+      </w:r>
+    </w:p>
+    <w:p>
+      <w:pPr>
+        <w:pStyle w:val="ListParagraph"/>
+        <w:numPr>
+          <w:ilvl w:val="0"/>
+          <w:numId w:val="1"/>
+        </w:numPr>
+        <w:spacing w:after="110" w:line="256"/>
+        <w:jc w:val="both"/>
+      </w:pPr>
+      <w:r>
+        <w:rPr>
+          <w:rFonts w:ascii="Arial" w:cs="Arial" w:eastAsia="Arial" w:hAnsi="Arial"/>
+          <w:b/>
+          <w:bCs/>
+          <w:color w:val="2A2620"/>
+          <w:sz w:val="21"/>
+          <w:szCs w:val="21"/>
+        </w:rPr>
+        <w:t xml:space="preserve">Faisal Al-Otaibi, Co-founder &amp; CEO: </w:t>
+      </w:r>
+      <w:r>
+        <w:rPr>
+          <w:rFonts w:ascii="Arial" w:cs="Arial" w:eastAsia="Arial" w:hAnsi="Arial"/>
+          <w:color w:val="2A2620"/>
+          <w:sz w:val="21"/>
+          <w:szCs w:val="21"/>
+        </w:rPr>
+        <w:t xml:space="preserve">Former operations lead at a Riyadh-based quick-commerce platform, where he built the last-mile dispatch system that Darb's routing engine is descended from. Industrial engineering background, King Saud University.</w:t>
+      </w:r>
+    </w:p>
+    <w:p>
+      <w:pPr>
+        <w:pStyle w:val="ListParagraph"/>
+        <w:numPr>
+          <w:ilvl w:val="0"/>
+          <w:numId w:val="1"/>
+        </w:numPr>
+        <w:spacing w:after="110" w:line="256"/>
+        <w:jc w:val="both"/>
+      </w:pPr>
+      <w:r>
+        <w:rPr>
+          <w:rFonts w:ascii="Arial" w:cs="Arial" w:eastAsia="Arial" w:hAnsi="Arial"/>
+          <w:b/>
+          <w:bCs/>
+          <w:color w:val="2A2620"/>
+          <w:sz w:val="21"/>
+          <w:szCs w:val="21"/>
+        </w:rPr>
+        <w:t xml:space="preserve">Nourah Al-Harbi, Co-founder &amp; CTO: </w:t>
+      </w:r>
+      <w:r>
+        <w:rPr>
+          <w:rFonts w:ascii="Arial" w:cs="Arial" w:eastAsia="Arial" w:hAnsi="Arial"/>
+          <w:color w:val="2A2620"/>
+          <w:sz w:val="21"/>
+          <w:szCs w:val="21"/>
+        </w:rPr>
+        <w:t xml:space="preserve">Previously a senior backend engineer on a regional ride-hailing platform's logistics team. Led Darb's API and carrier-integration architecture from day one. Computer science background, KFUPM.</w:t>
+      </w:r>
+    </w:p>
+    <w:p>
+      <w:pPr>
+        <w:pStyle w:val="ListParagraph"/>
+        <w:numPr>
+          <w:ilvl w:val="0"/>
+          <w:numId w:val="1"/>
+        </w:numPr>
+        <w:spacing w:after="110" w:line="256"/>
+        <w:jc w:val="both"/>
+      </w:pPr>
+      <w:r>
+        <w:rPr>
+          <w:rFonts w:ascii="Arial" w:cs="Arial" w:eastAsia="Arial" w:hAnsi="Arial"/>
+          <w:b/>
+          <w:bCs/>
+          <w:color w:val="2A2620"/>
+          <w:sz w:val="21"/>
+          <w:szCs w:val="21"/>
+        </w:rPr>
+        <w:t xml:space="preserve">Khalid Al-Dossari, Co-founder &amp; Head of Revenue: </w:t>
+      </w:r>
+      <w:r>
+        <w:rPr>
+          <w:rFonts w:ascii="Arial" w:cs="Arial" w:eastAsia="Arial" w:hAnsi="Arial"/>
+          <w:color w:val="2A2620"/>
+          <w:sz w:val="21"/>
+          <w:szCs w:val="21"/>
+        </w:rPr>
+        <w:t xml:space="preserve">Ten years in enterprise SaaS sales across the GCC prior to Darb, most recently running mid-market sales for a regional fleet-management vendor. Owns Darb's enterprise and quick-commerce partnership pipeline.</w:t>
+      </w:r>
+    </w:p>
+    <w:p>
+      <w:pPr>
+        <w:spacing w:after="200" w:before="40"/>
+      </w:pPr>
+      <w:r>
+        <w:rPr>
+          <w:rFonts w:ascii="Arial" w:cs="Arial" w:eastAsia="Arial" w:hAnsi="Arial"/>
+          <w:i/>
+          <w:iCs/>
+          <w:color w:val="6B6455"/>
+          <w:sz w:val="17"/>
+          <w:szCs w:val="17"/>
+        </w:rPr>
+        <w:t xml:space="preserve">Source: Darb Data Room · Screening Summary, p.4</w:t>
+      </w:r>
+    </w:p>
+    <w:p>
+      <w:pPr>
+        <w:spacing w:after="0" w:before="220"/>
+      </w:pPr>
+    </w:p>
+    <w:p>
+      <w:pPr>
+        <w:pStyle w:val="Heading1"/>
+        <w:pBdr>
+          <w:bottom w:val="single" w:color="B08D2A" w:sz="12"/>
+        </w:pBdr>
+        <w:shd w:fill="2A2620" w:color="auto" w:val="clear"/>
+        <w:spacing w:after="240" w:before="90"/>
+        <w:ind w:left="172"/>
+      </w:pPr>
+      <w:r>
+        <w:rPr>
+          <w:rFonts w:ascii="Georgia" w:cs="Georgia" w:eastAsia="Georgia" w:hAnsi="Georgia"/>
+          <w:b/>
+          <w:bCs/>
+          <w:color w:val="F5F1E6"/>
+          <w:sz w:val="28"/>
+          <w:szCs w:val="28"/>
+        </w:rPr>
+        <w:t xml:space="preserve">Financial Summary and Use of Proceeds</w:t>
+      </w:r>
+    </w:p>
+    <w:p>
+      <w:pPr>
+        <w:spacing w:after="160" w:line="264"/>
+        <w:jc w:val="both"/>
+      </w:pPr>
+      <w:r>
+        <w:rPr>
+          <w:rFonts w:ascii="Arial" w:cs="Arial" w:eastAsia="Arial" w:hAnsi="Arial"/>
+          <w:color w:val="2A2620"/>
+          <w:sz w:val="21"/>
+          <w:szCs w:val="21"/>
+        </w:rPr>
+        <w:t xml:space="preserve">The figures below are Darb's own reporting, unaudited, as shared at the screening stage. Full audited or reviewed financial statements for FY2023-FY2025 sit in the data room under NDA and are a required diligence item before any ticket is issued.</w:t>
       </w:r>
     </w:p>
     <w:tbl>
@@ -2187,7 +2645,7 @@
         </w:trPr>
         <w:tc>
           <w:tcPr>
-            <w:tcW w:type="pct" w:w="22%"/>
+            <w:tcW w:type="pct" w:w="40%"/>
             <w:shd w:fill="2A2620" w:color="auto" w:val="clear"/>
             <w:tcMar>
               <w:top w:type="dxa" w:w="70"/>
@@ -2210,13 +2668,13 @@
                 <w:sz w:val="19"/>
                 <w:szCs w:val="19"/>
               </w:rPr>
-              <w:t xml:space="preserve">Criterion</w:t>
-            </w:r>
-          </w:p>
-        </w:tc>
-        <w:tc>
-          <w:tcPr>
-            <w:tcW w:type="pct" w:w="12%"/>
+              <w:t xml:space="preserve">Metric</w:t>
+            </w:r>
+          </w:p>
+        </w:tc>
+        <w:tc>
+          <w:tcPr>
+            <w:tcW w:type="pct" w:w="30%"/>
             <w:shd w:fill="2A2620" w:color="auto" w:val="clear"/>
             <w:tcMar>
               <w:top w:type="dxa" w:w="70"/>
@@ -2239,13 +2697,13 @@
                 <w:sz w:val="19"/>
                 <w:szCs w:val="19"/>
               </w:rPr>
-              <w:t xml:space="preserve">Verdict</w:t>
-            </w:r>
-          </w:p>
-        </w:tc>
-        <w:tc>
-          <w:tcPr>
-            <w:tcW w:type="pct" w:w="66%"/>
+              <w:t xml:space="preserve">FY2025A</w:t>
+            </w:r>
+          </w:p>
+        </w:tc>
+        <w:tc>
+          <w:tcPr>
+            <w:tcW w:type="pct" w:w="30%"/>
             <w:shd w:fill="2A2620" w:color="auto" w:val="clear"/>
             <w:tcMar>
               <w:top w:type="dxa" w:w="70"/>
@@ -2268,7 +2726,7 @@
                 <w:sz w:val="19"/>
                 <w:szCs w:val="19"/>
               </w:rPr>
-              <w:t xml:space="preserve">Detail</w:t>
+              <w:t xml:space="preserve">FY2026E</w:t>
             </w:r>
           </w:p>
         </w:tc>
@@ -2276,35 +2734,35 @@
       <w:tr>
         <w:tc>
           <w:tcPr>
-            <w:tcW w:type="pct" w:w="22%"/>
-            <w:tcMar>
-              <w:top w:type="dxa" w:w="70"/>
-              <w:left w:type="dxa" w:w="110"/>
-              <w:bottom w:type="dxa" w:w="70"/>
-              <w:right w:type="dxa" w:w="110"/>
-            </w:tcMar>
-            <w:vAlign w:val="center"/>
-          </w:tcPr>
-          <w:p>
-            <w:pPr>
-              <w:jc w:val="left"/>
-            </w:pPr>
-            <w:r>
-              <w:rPr>
-                <w:rFonts w:ascii="Arial" w:cs="Arial" w:eastAsia="Arial" w:hAnsi="Arial"/>
-                <w:b w:val="false"/>
-                <w:bCs w:val="false"/>
-                <w:color w:val="2A2620"/>
-                <w:sz w:val="19"/>
-                <w:szCs w:val="19"/>
-              </w:rPr>
-              <w:t xml:space="preserve">Sector mandate</w:t>
-            </w:r>
-          </w:p>
-        </w:tc>
-        <w:tc>
-          <w:tcPr>
-            <w:tcW w:type="pct" w:w="12%"/>
+            <w:tcW w:type="pct" w:w="40%"/>
+            <w:tcMar>
+              <w:top w:type="dxa" w:w="70"/>
+              <w:left w:type="dxa" w:w="110"/>
+              <w:bottom w:type="dxa" w:w="70"/>
+              <w:right w:type="dxa" w:w="110"/>
+            </w:tcMar>
+            <w:vAlign w:val="center"/>
+          </w:tcPr>
+          <w:p>
+            <w:pPr>
+              <w:jc w:val="left"/>
+            </w:pPr>
+            <w:r>
+              <w:rPr>
+                <w:rFonts w:ascii="Arial" w:cs="Arial" w:eastAsia="Arial" w:hAnsi="Arial"/>
+                <w:b w:val="false"/>
+                <w:bCs w:val="false"/>
+                <w:color w:val="2A2620"/>
+                <w:sz w:val="19"/>
+                <w:szCs w:val="19"/>
+              </w:rPr>
+              <w:t xml:space="preserve">Annual Recurring Revenue (ARR)</w:t>
+            </w:r>
+          </w:p>
+        </w:tc>
+        <w:tc>
+          <w:tcPr>
+            <w:tcW w:type="pct" w:w="30%"/>
             <w:tcMar>
               <w:top w:type="dxa" w:w="70"/>
               <w:left w:type="dxa" w:w="110"/>
@@ -2326,13 +2784,13 @@
                 <w:sz w:val="19"/>
                 <w:szCs w:val="19"/>
               </w:rPr>
-              <w:t xml:space="preserve">PASS</w:t>
-            </w:r>
-          </w:p>
-        </w:tc>
-        <w:tc>
-          <w:tcPr>
-            <w:tcW w:type="pct" w:w="66%"/>
+              <w:t xml:space="preserve">SAR 18.2m</w:t>
+            </w:r>
+          </w:p>
+        </w:tc>
+        <w:tc>
+          <w:tcPr>
+            <w:tcW w:type="pct" w:w="30%"/>
             <w:tcMar>
               <w:top w:type="dxa" w:w="70"/>
               <w:left w:type="dxa" w:w="110"/>
@@ -2354,7 +2812,7 @@
                 <w:sz w:val="19"/>
                 <w:szCs w:val="19"/>
               </w:rPr>
-              <w:t xml:space="preserve">Logistics SaaS falls within the Technology &amp; Consumer mandate.</w:t>
+              <w:t xml:space="preserve">SAR 29.5m</w:t>
             </w:r>
           </w:p>
         </w:tc>
@@ -2362,7 +2820,7 @@
       <w:tr>
         <w:tc>
           <w:tcPr>
-            <w:tcW w:type="pct" w:w="22%"/>
+            <w:tcW w:type="pct" w:w="40%"/>
             <w:shd w:fill="FBF9F4" w:color="auto" w:val="clear"/>
             <w:tcMar>
               <w:top w:type="dxa" w:w="70"/>
@@ -2385,13 +2843,13 @@
                 <w:sz w:val="19"/>
                 <w:szCs w:val="19"/>
               </w:rPr>
-              <w:t xml:space="preserve">Ticket vs mandate</w:t>
-            </w:r>
-          </w:p>
-        </w:tc>
-        <w:tc>
-          <w:tcPr>
-            <w:tcW w:type="pct" w:w="12%"/>
+              <w:t xml:space="preserve">YoY ARR growth</w:t>
+            </w:r>
+          </w:p>
+        </w:tc>
+        <w:tc>
+          <w:tcPr>
+            <w:tcW w:type="pct" w:w="30%"/>
             <w:shd w:fill="FBF9F4" w:color="auto" w:val="clear"/>
             <w:tcMar>
               <w:top w:type="dxa" w:w="70"/>
@@ -2414,13 +2872,13 @@
                 <w:sz w:val="19"/>
                 <w:szCs w:val="19"/>
               </w:rPr>
-              <w:t xml:space="preserve">PASS</w:t>
-            </w:r>
-          </w:p>
-        </w:tc>
-        <w:tc>
-          <w:tcPr>
-            <w:tcW w:type="pct" w:w="66%"/>
+              <w:t xml:space="preserve">–</w:t>
+            </w:r>
+          </w:p>
+        </w:tc>
+        <w:tc>
+          <w:tcPr>
+            <w:tcW w:type="pct" w:w="30%"/>
             <w:shd w:fill="FBF9F4" w:color="auto" w:val="clear"/>
             <w:tcMar>
               <w:top w:type="dxa" w:w="70"/>
@@ -2443,7 +2901,7 @@
                 <w:sz w:val="19"/>
                 <w:szCs w:val="19"/>
               </w:rPr>
-              <w:t xml:space="preserve">SAR 40M ask sits within the SAR 20-60M ticket band.</w:t>
+              <w:t xml:space="preserve">62%</w:t>
             </w:r>
           </w:p>
         </w:tc>
@@ -2451,35 +2909,35 @@
       <w:tr>
         <w:tc>
           <w:tcPr>
-            <w:tcW w:type="pct" w:w="22%"/>
-            <w:tcMar>
-              <w:top w:type="dxa" w:w="70"/>
-              <w:left w:type="dxa" w:w="110"/>
-              <w:bottom w:type="dxa" w:w="70"/>
-              <w:right w:type="dxa" w:w="110"/>
-            </w:tcMar>
-            <w:vAlign w:val="center"/>
-          </w:tcPr>
-          <w:p>
-            <w:pPr>
-              <w:jc w:val="left"/>
-            </w:pPr>
-            <w:r>
-              <w:rPr>
-                <w:rFonts w:ascii="Arial" w:cs="Arial" w:eastAsia="Arial" w:hAnsi="Arial"/>
-                <w:b w:val="false"/>
-                <w:bCs w:val="false"/>
-                <w:color w:val="2A2620"/>
-                <w:sz w:val="19"/>
-                <w:szCs w:val="19"/>
-              </w:rPr>
-              <w:t xml:space="preserve">Stage fit</w:t>
-            </w:r>
-          </w:p>
-        </w:tc>
-        <w:tc>
-          <w:tcPr>
-            <w:tcW w:type="pct" w:w="12%"/>
+            <w:tcW w:type="pct" w:w="40%"/>
+            <w:tcMar>
+              <w:top w:type="dxa" w:w="70"/>
+              <w:left w:type="dxa" w:w="110"/>
+              <w:bottom w:type="dxa" w:w="70"/>
+              <w:right w:type="dxa" w:w="110"/>
+            </w:tcMar>
+            <w:vAlign w:val="center"/>
+          </w:tcPr>
+          <w:p>
+            <w:pPr>
+              <w:jc w:val="left"/>
+            </w:pPr>
+            <w:r>
+              <w:rPr>
+                <w:rFonts w:ascii="Arial" w:cs="Arial" w:eastAsia="Arial" w:hAnsi="Arial"/>
+                <w:b w:val="false"/>
+                <w:bCs w:val="false"/>
+                <w:color w:val="2A2620"/>
+                <w:sz w:val="19"/>
+                <w:szCs w:val="19"/>
+              </w:rPr>
+              <w:t xml:space="preserve">Gross margin</w:t>
+            </w:r>
+          </w:p>
+        </w:tc>
+        <w:tc>
+          <w:tcPr>
+            <w:tcW w:type="pct" w:w="30%"/>
             <w:tcMar>
               <w:top w:type="dxa" w:w="70"/>
               <w:left w:type="dxa" w:w="110"/>
@@ -2501,13 +2959,13 @@
                 <w:sz w:val="19"/>
                 <w:szCs w:val="19"/>
               </w:rPr>
-              <w:t xml:space="preserve">PASS</w:t>
-            </w:r>
-          </w:p>
-        </w:tc>
-        <w:tc>
-          <w:tcPr>
-            <w:tcW w:type="pct" w:w="66%"/>
+              <w:t xml:space="preserve">68%</w:t>
+            </w:r>
+          </w:p>
+        </w:tc>
+        <w:tc>
+          <w:tcPr>
+            <w:tcW w:type="pct" w:w="30%"/>
             <w:tcMar>
               <w:top w:type="dxa" w:w="70"/>
               <w:left w:type="dxa" w:w="110"/>
@@ -2529,7 +2987,7 @@
                 <w:sz w:val="19"/>
                 <w:szCs w:val="19"/>
               </w:rPr>
-              <w:t xml:space="preserve">Series B falls within the mandated Series A-C stage window.</w:t>
+              <w:t xml:space="preserve">71%</w:t>
             </w:r>
           </w:p>
         </w:tc>
@@ -2537,7 +2995,7 @@
       <w:tr>
         <w:tc>
           <w:tcPr>
-            <w:tcW w:type="pct" w:w="22%"/>
+            <w:tcW w:type="pct" w:w="40%"/>
             <w:shd w:fill="FBF9F4" w:color="auto" w:val="clear"/>
             <w:tcMar>
               <w:top w:type="dxa" w:w="70"/>
@@ -2560,13 +3018,13 @@
                 <w:sz w:val="19"/>
                 <w:szCs w:val="19"/>
               </w:rPr>
-              <w:t xml:space="preserve">Compliance pre-screen</w:t>
-            </w:r>
-          </w:p>
-        </w:tc>
-        <w:tc>
-          <w:tcPr>
-            <w:tcW w:type="pct" w:w="12%"/>
+              <w:t xml:space="preserve">Net revenue retention (NRR)</w:t>
+            </w:r>
+          </w:p>
+        </w:tc>
+        <w:tc>
+          <w:tcPr>
+            <w:tcW w:type="pct" w:w="30%"/>
             <w:shd w:fill="FBF9F4" w:color="auto" w:val="clear"/>
             <w:tcMar>
               <w:top w:type="dxa" w:w="70"/>
@@ -2589,13 +3047,13 @@
                 <w:sz w:val="19"/>
                 <w:szCs w:val="19"/>
               </w:rPr>
-              <w:t xml:space="preserve">PASS</w:t>
-            </w:r>
-          </w:p>
-        </w:tc>
-        <w:tc>
-          <w:tcPr>
-            <w:tcW w:type="pct" w:w="66%"/>
+              <w:t xml:space="preserve">118%</w:t>
+            </w:r>
+          </w:p>
+        </w:tc>
+        <w:tc>
+          <w:tcPr>
+            <w:tcW w:type="pct" w:w="30%"/>
             <w:shd w:fill="FBF9F4" w:color="auto" w:val="clear"/>
             <w:tcMar>
               <w:top w:type="dxa" w:w="70"/>
@@ -2618,7 +3076,7 @@
                 <w:sz w:val="19"/>
                 <w:szCs w:val="19"/>
               </w:rPr>
-              <w:t xml:space="preserve">Business activity eligible; no leverage red flags at pre-screen.</w:t>
+              <w:t xml:space="preserve">124%</w:t>
             </w:r>
           </w:p>
         </w:tc>
@@ -2626,35 +3084,35 @@
       <w:tr>
         <w:tc>
           <w:tcPr>
-            <w:tcW w:type="pct" w:w="22%"/>
-            <w:tcMar>
-              <w:top w:type="dxa" w:w="70"/>
-              <w:left w:type="dxa" w:w="110"/>
-              <w:bottom w:type="dxa" w:w="70"/>
-              <w:right w:type="dxa" w:w="110"/>
-            </w:tcMar>
-            <w:vAlign w:val="center"/>
-          </w:tcPr>
-          <w:p>
-            <w:pPr>
-              <w:jc w:val="left"/>
-            </w:pPr>
-            <w:r>
-              <w:rPr>
-                <w:rFonts w:ascii="Arial" w:cs="Arial" w:eastAsia="Arial" w:hAnsi="Arial"/>
-                <w:b w:val="false"/>
-                <w:bCs w:val="false"/>
-                <w:color w:val="2A2620"/>
-                <w:sz w:val="19"/>
-                <w:szCs w:val="19"/>
-              </w:rPr>
-              <w:t xml:space="preserve">Concentration</w:t>
-            </w:r>
-          </w:p>
-        </w:tc>
-        <w:tc>
-          <w:tcPr>
-            <w:tcW w:type="pct" w:w="12%"/>
+            <w:tcW w:type="pct" w:w="40%"/>
+            <w:tcMar>
+              <w:top w:type="dxa" w:w="70"/>
+              <w:left w:type="dxa" w:w="110"/>
+              <w:bottom w:type="dxa" w:w="70"/>
+              <w:right w:type="dxa" w:w="110"/>
+            </w:tcMar>
+            <w:vAlign w:val="center"/>
+          </w:tcPr>
+          <w:p>
+            <w:pPr>
+              <w:jc w:val="left"/>
+            </w:pPr>
+            <w:r>
+              <w:rPr>
+                <w:rFonts w:ascii="Arial" w:cs="Arial" w:eastAsia="Arial" w:hAnsi="Arial"/>
+                <w:b w:val="false"/>
+                <w:bCs w:val="false"/>
+                <w:color w:val="2A2620"/>
+                <w:sz w:val="19"/>
+                <w:szCs w:val="19"/>
+              </w:rPr>
+              <w:t xml:space="preserve">Logo count (active customers)</w:t>
+            </w:r>
+          </w:p>
+        </w:tc>
+        <w:tc>
+          <w:tcPr>
+            <w:tcW w:type="pct" w:w="30%"/>
             <w:tcMar>
               <w:top w:type="dxa" w:w="70"/>
               <w:left w:type="dxa" w:w="110"/>
@@ -2676,13 +3134,13 @@
                 <w:sz w:val="19"/>
                 <w:szCs w:val="19"/>
               </w:rPr>
-              <w:t xml:space="preserve">WARN</w:t>
-            </w:r>
-          </w:p>
-        </w:tc>
-        <w:tc>
-          <w:tcPr>
-            <w:tcW w:type="pct" w:w="66%"/>
+              <w:t xml:space="preserve">34</w:t>
+            </w:r>
+          </w:p>
+        </w:tc>
+        <w:tc>
+          <w:tcPr>
+            <w:tcW w:type="pct" w:w="30%"/>
             <w:tcMar>
               <w:top w:type="dxa" w:w="70"/>
               <w:left w:type="dxa" w:w="110"/>
@@ -2704,7 +3162,7 @@
                 <w:sz w:val="19"/>
                 <w:szCs w:val="19"/>
               </w:rPr>
-              <w:t xml:space="preserve">Technology &amp; Consumer sector exposure at 8.5% of AUM; a SAR 40M ticket (2.0% of AUM) would bring post-deal sector exposure to 10.5%, above the 10% cap.</w:t>
+              <w:t xml:space="preserve">52</w:t>
             </w:r>
           </w:p>
         </w:tc>
@@ -2712,7 +3170,7 @@
       <w:tr>
         <w:tc>
           <w:tcPr>
-            <w:tcW w:type="pct" w:w="22%"/>
+            <w:tcW w:type="pct" w:w="40%"/>
             <w:shd w:fill="FBF9F4" w:color="auto" w:val="clear"/>
             <w:tcMar>
               <w:top w:type="dxa" w:w="70"/>
@@ -2735,13 +3193,13 @@
                 <w:sz w:val="19"/>
                 <w:szCs w:val="19"/>
               </w:rPr>
-              <w:t xml:space="preserve">Red flags</w:t>
-            </w:r>
-          </w:p>
-        </w:tc>
-        <w:tc>
-          <w:tcPr>
-            <w:tcW w:type="pct" w:w="12%"/>
+              <w:t xml:space="preserve">Monthly cash burn (avg.)</w:t>
+            </w:r>
+          </w:p>
+        </w:tc>
+        <w:tc>
+          <w:tcPr>
+            <w:tcW w:type="pct" w:w="30%"/>
             <w:shd w:fill="FBF9F4" w:color="auto" w:val="clear"/>
             <w:tcMar>
               <w:top w:type="dxa" w:w="70"/>
@@ -2764,13 +3222,13 @@
                 <w:sz w:val="19"/>
                 <w:szCs w:val="19"/>
               </w:rPr>
-              <w:t xml:space="preserve">PASS</w:t>
-            </w:r>
-          </w:p>
-        </w:tc>
-        <w:tc>
-          <w:tcPr>
-            <w:tcW w:type="pct" w:w="66%"/>
+              <w:t xml:space="preserve">SAR 1.4m</w:t>
+            </w:r>
+          </w:p>
+        </w:tc>
+        <w:tc>
+          <w:tcPr>
+            <w:tcW w:type="pct" w:w="30%"/>
             <w:shd w:fill="FBF9F4" w:color="auto" w:val="clear"/>
             <w:tcMar>
               <w:top w:type="dxa" w:w="70"/>
@@ -2793,7 +3251,93 @@
                 <w:sz w:val="19"/>
                 <w:szCs w:val="19"/>
               </w:rPr>
-              <w:t xml:space="preserve">No sanctions, conflicts-of-interest, or related-party issues identified.</w:t>
+              <w:t xml:space="preserve">–</w:t>
+            </w:r>
+          </w:p>
+        </w:tc>
+      </w:tr>
+      <w:tr>
+        <w:tc>
+          <w:tcPr>
+            <w:tcW w:type="pct" w:w="40%"/>
+            <w:tcMar>
+              <w:top w:type="dxa" w:w="70"/>
+              <w:left w:type="dxa" w:w="110"/>
+              <w:bottom w:type="dxa" w:w="70"/>
+              <w:right w:type="dxa" w:w="110"/>
+            </w:tcMar>
+            <w:vAlign w:val="center"/>
+          </w:tcPr>
+          <w:p>
+            <w:pPr>
+              <w:jc w:val="left"/>
+            </w:pPr>
+            <w:r>
+              <w:rPr>
+                <w:rFonts w:ascii="Arial" w:cs="Arial" w:eastAsia="Arial" w:hAnsi="Arial"/>
+                <w:b w:val="false"/>
+                <w:bCs w:val="false"/>
+                <w:color w:val="2A2620"/>
+                <w:sz w:val="19"/>
+                <w:szCs w:val="19"/>
+              </w:rPr>
+              <w:t xml:space="preserve">Cash runway at close (post-round)</w:t>
+            </w:r>
+          </w:p>
+        </w:tc>
+        <w:tc>
+          <w:tcPr>
+            <w:tcW w:type="pct" w:w="30%"/>
+            <w:tcMar>
+              <w:top w:type="dxa" w:w="70"/>
+              <w:left w:type="dxa" w:w="110"/>
+              <w:bottom w:type="dxa" w:w="70"/>
+              <w:right w:type="dxa" w:w="110"/>
+            </w:tcMar>
+            <w:vAlign w:val="center"/>
+          </w:tcPr>
+          <w:p>
+            <w:pPr>
+              <w:jc w:val="center"/>
+            </w:pPr>
+            <w:r>
+              <w:rPr>
+                <w:rFonts w:ascii="Arial" w:cs="Arial" w:eastAsia="Arial" w:hAnsi="Arial"/>
+                <w:b w:val="false"/>
+                <w:bCs w:val="false"/>
+                <w:color w:val="2A2620"/>
+                <w:sz w:val="19"/>
+                <w:szCs w:val="19"/>
+              </w:rPr>
+              <w:t xml:space="preserve">–</w:t>
+            </w:r>
+          </w:p>
+        </w:tc>
+        <w:tc>
+          <w:tcPr>
+            <w:tcW w:type="pct" w:w="30%"/>
+            <w:tcMar>
+              <w:top w:type="dxa" w:w="70"/>
+              <w:left w:type="dxa" w:w="110"/>
+              <w:bottom w:type="dxa" w:w="70"/>
+              <w:right w:type="dxa" w:w="110"/>
+            </w:tcMar>
+            <w:vAlign w:val="center"/>
+          </w:tcPr>
+          <w:p>
+            <w:pPr>
+              <w:jc w:val="center"/>
+            </w:pPr>
+            <w:r>
+              <w:rPr>
+                <w:rFonts w:ascii="Arial" w:cs="Arial" w:eastAsia="Arial" w:hAnsi="Arial"/>
+                <w:b w:val="false"/>
+                <w:bCs w:val="false"/>
+                <w:color w:val="2A2620"/>
+                <w:sz w:val="19"/>
+                <w:szCs w:val="19"/>
+              </w:rPr>
+              <w:t xml:space="preserve">~24 months</w:t>
             </w:r>
           </w:p>
         </w:tc>
@@ -2812,11 +3356,14 @@
           <w:sz w:val="17"/>
           <w:szCs w:val="17"/>
         </w:rPr>
-        <w:t xml:space="preserve">Source: Lunar IC Charter &amp; Investment Mandate, p.3; Source: Lunar IC Charter &amp; Investment Mandate, p.4; Source: Lunar IC Charter &amp; Investment Mandate, p.5.</w:t>
-      </w:r>
-    </w:p>
-    <w:p>
-      <w:pPr>
+        <w:t xml:space="preserve">Source: Darb Data Room · Screening Summary, p.3. Company-reported and unaudited at screening stage.</w:t>
+      </w:r>
+    </w:p>
+    <w:p>
+      <w:pPr>
+        <w:pBdr>
+          <w:bottom w:val="single" w:color="D8D2C4" w:sz="4"/>
+        </w:pBdr>
         <w:spacing w:after="90" w:before="220"/>
       </w:pPr>
       <w:r>
@@ -2828,7 +3375,7 @@
           <w:sz w:val="24"/>
           <w:szCs w:val="24"/>
         </w:rPr>
-        <w:t xml:space="preserve">Concentration detail</w:t>
+        <w:t xml:space="preserve">Use of proceeds</w:t>
       </w:r>
     </w:p>
     <w:p>
@@ -2843,7 +3390,7 @@
           <w:sz w:val="21"/>
           <w:szCs w:val="21"/>
         </w:rPr>
-        <w:t xml:space="preserve">The Technology &amp; Consumer sector bucket currently sits at 8.5% of firm AUM. A SAR 40M ticket represents a further 2.0% of AUM, bringing post-deal sector exposure to 10.5%, above the Charter's 10% sector concentration cap. Per the Charter, this does not automatically fail the screen, but it requires explicit IC acknowledgement of the mandate breach before the deal may advance.</w:t>
+        <w:t xml:space="preserve">Management indicates the SAR 40M Series B is earmarked roughly 55% for go-to-market expansion (enterprise sales, quick-commerce partnerships), 30% for product and engineering headcount, and 15% for working capital and runway extension.</w:t>
       </w:r>
     </w:p>
     <w:p>
@@ -2859,168 +3406,32 @@
           <w:sz w:val="17"/>
           <w:szCs w:val="17"/>
         </w:rPr>
-        <w:t xml:space="preserve">Source: Lunar Current Portfolio Snapshot, p.1; Source: Lunar IC Charter &amp; Investment Mandate, p.4.</w:t>
-      </w:r>
-    </w:p>
-    <w:p>
-      <w:pPr>
-        <w:spacing w:after="90" w:before="220"/>
-      </w:pPr>
-      <w:r>
-        <w:rPr>
-          <w:rFonts w:ascii="Arial" w:cs="Arial" w:eastAsia="Arial" w:hAnsi="Arial"/>
-          <w:b/>
-          <w:bCs/>
-          <w:color w:val="514B40"/>
-          <w:sz w:val="24"/>
-          <w:szCs w:val="24"/>
-        </w:rPr>
-        <w:t xml:space="preserve">Red flags</w:t>
-      </w:r>
-    </w:p>
-    <w:p>
-      <w:pPr>
-        <w:spacing w:after="160" w:line="264"/>
-        <w:jc w:val="both"/>
-      </w:pPr>
-      <w:r>
-        <w:rPr>
-          <w:rFonts w:ascii="Arial" w:cs="Arial" w:eastAsia="Arial" w:hAnsi="Arial"/>
-          <w:color w:val="2A2620"/>
-          <w:sz w:val="21"/>
-          <w:szCs w:val="21"/>
-        </w:rPr>
-        <w:t xml:space="preserve">No sanctions, conflicts-of-interest, or related-party issues were identified at the pre-screen stage.</w:t>
-      </w:r>
+        <w:t xml:space="preserve">Source: Darb Data Room · Screening Summary, p.3</w:t>
+      </w:r>
+    </w:p>
+    <w:p>
+      <w:pPr>
+        <w:spacing w:after="0" w:before="220"/>
+      </w:pPr>
     </w:p>
     <w:p>
       <w:pPr>
         <w:pStyle w:val="Heading1"/>
         <w:pBdr>
-          <w:bottom w:val="single" w:color="B08D2A" w:sz="10"/>
+          <w:bottom w:val="single" w:color="B08D2A" w:sz="12"/>
         </w:pBdr>
-        <w:spacing w:after="140" w:before="420"/>
+        <w:shd w:fill="2A2620" w:color="auto" w:val="clear"/>
+        <w:spacing w:after="240" w:before="90"/>
+        <w:ind w:left="172"/>
       </w:pPr>
       <w:r>
         <w:rPr>
           <w:rFonts w:ascii="Georgia" w:cs="Georgia" w:eastAsia="Georgia" w:hAnsi="Georgia"/>
           <w:b/>
           <w:bCs/>
-          <w:color w:val="2A2620"/>
-          <w:sz w:val="32"/>
-          <w:szCs w:val="32"/>
-        </w:rPr>
-        <w:t xml:space="preserve">Risks and Open Diligence Items</w:t>
-      </w:r>
-    </w:p>
-    <w:p>
-      <w:pPr>
-        <w:pStyle w:val="ListParagraph"/>
-        <w:numPr>
-          <w:ilvl w:val="0"/>
-          <w:numId w:val="1"/>
-        </w:numPr>
-        <w:spacing w:after="80" w:line="250"/>
-      </w:pPr>
-      <w:r>
-        <w:rPr>
-          <w:rFonts w:ascii="Arial" w:cs="Arial" w:eastAsia="Arial" w:hAnsi="Arial"/>
-          <w:color w:val="2A2620"/>
-          <w:sz w:val="21"/>
-          <w:szCs w:val="21"/>
-        </w:rPr>
-        <w:t xml:space="preserve">All financial figures in this memo are company-reported and unaudited, full audited/reviewed statements for FY2023-FY2025 are pending under NDA.</w:t>
-      </w:r>
-    </w:p>
-    <w:p>
-      <w:pPr>
-        <w:pStyle w:val="ListParagraph"/>
-        <w:numPr>
-          <w:ilvl w:val="0"/>
-          <w:numId w:val="1"/>
-        </w:numPr>
-        <w:spacing w:after="80" w:line="250"/>
-      </w:pPr>
-      <w:r>
-        <w:rPr>
-          <w:rFonts w:ascii="Arial" w:cs="Arial" w:eastAsia="Arial" w:hAnsi="Arial"/>
-          <w:color w:val="2A2620"/>
-          <w:sz w:val="21"/>
-          <w:szCs w:val="21"/>
-        </w:rPr>
-        <w:t xml:space="preserve">Customer concentration is unknown until the full data room (customer contracts and cohort-level retention) is reviewed, the segment split shared at screening is anonymized.</w:t>
-      </w:r>
-    </w:p>
-    <w:p>
-      <w:pPr>
-        <w:pStyle w:val="ListParagraph"/>
-        <w:numPr>
-          <w:ilvl w:val="0"/>
-          <w:numId w:val="1"/>
-        </w:numPr>
-        <w:spacing w:after="80" w:line="250"/>
-      </w:pPr>
-      <w:r>
-        <w:rPr>
-          <w:rFonts w:ascii="Arial" w:cs="Arial" w:eastAsia="Arial" w:hAnsi="Arial"/>
-          <w:color w:val="2A2620"/>
-          <w:sz w:val="21"/>
-          <w:szCs w:val="21"/>
-        </w:rPr>
-        <w:t xml:space="preserve">Net revenue retention durability at 118-124% has not been independently tested against cohort-level churn data.</w:t>
-      </w:r>
-    </w:p>
-    <w:p>
-      <w:pPr>
-        <w:pStyle w:val="ListParagraph"/>
-        <w:numPr>
-          <w:ilvl w:val="0"/>
-          <w:numId w:val="1"/>
-        </w:numPr>
-        <w:spacing w:after="80" w:line="250"/>
-      </w:pPr>
-      <w:r>
-        <w:rPr>
-          <w:rFonts w:ascii="Arial" w:cs="Arial" w:eastAsia="Arial" w:hAnsi="Arial"/>
-          <w:color w:val="2A2620"/>
-          <w:sz w:val="21"/>
-          <w:szCs w:val="21"/>
-        </w:rPr>
-        <w:t xml:space="preserve">Competitive response from in-house dispatch tooling built by large logistics operators and quick-commerce platforms is management's stated primary competitive risk, not yet independently assessed.</w:t>
-      </w:r>
-    </w:p>
-    <w:p>
-      <w:pPr>
-        <w:spacing w:after="200" w:before="40"/>
-      </w:pPr>
-      <w:r>
-        <w:rPr>
-          <w:rFonts w:ascii="Arial" w:cs="Arial" w:eastAsia="Arial" w:hAnsi="Arial"/>
-          <w:i/>
-          <w:iCs/>
-          <w:color w:val="6B6455"/>
-          <w:sz w:val="17"/>
-          <w:szCs w:val="17"/>
-        </w:rPr>
-        <w:t xml:space="preserve">Source: Darb Data Room · Screening Summary, p.6</w:t>
-      </w:r>
-    </w:p>
-    <w:p>
-      <w:pPr>
-        <w:pStyle w:val="Heading1"/>
-        <w:pBdr>
-          <w:bottom w:val="single" w:color="B08D2A" w:sz="10"/>
-        </w:pBdr>
-        <w:spacing w:after="140" w:before="420"/>
-      </w:pPr>
-      <w:r>
-        <w:rPr>
-          <w:rFonts w:ascii="Georgia" w:cs="Georgia" w:eastAsia="Georgia" w:hAnsi="Georgia"/>
-          <w:b/>
-          <w:bCs/>
-          <w:color w:val="2A2620"/>
-          <w:sz w:val="32"/>
-          <w:szCs w:val="32"/>
+          <w:color w:val="F5F1E6"/>
+          <w:sz w:val="28"/>
+          <w:szCs w:val="28"/>
         </w:rPr>
         <w:t xml:space="preserve">Appendix: Sources</w:t>
       </w:r>

</xml_diff>